<commit_message>
V0003  include pending modified and untracked files (mega menu, theme, navbar, vendor pages, tests, docs, and cypress artifacts)
</commit_message>
<xml_diff>
--- a/docs/Merkato Frontend Architecture.docx
+++ b/docs/Merkato Frontend Architecture.docx
@@ -5881,10 +5881,2612 @@
         <w:rPr>
           <w:b/>
           <w:bCs/>
-          <w:sz w:val="22"/>
-          <w:szCs w:val="22"/>
-        </w:rPr>
-      </w:pPr>
+          <w:sz w:val="32"/>
+          <w:szCs w:val="32"/>
+        </w:rPr>
+      </w:pPr>
+      <w:r>
+        <w:rPr>
+          <w:b/>
+          <w:bCs/>
+          <w:sz w:val="32"/>
+          <w:szCs w:val="32"/>
+        </w:rPr>
+        <w:t xml:space="preserve">Merkato </w:t>
+      </w:r>
+      <w:r>
+        <w:rPr>
+          <w:b/>
+          <w:bCs/>
+          <w:sz w:val="32"/>
+          <w:szCs w:val="32"/>
+        </w:rPr>
+        <w:tab/>
+      </w:r>
+      <w:r>
+        <w:rPr>
+          <w:b/>
+          <w:bCs/>
+          <w:sz w:val="32"/>
+          <w:szCs w:val="32"/>
+        </w:rPr>
+        <w:t>Footer</w:t>
+      </w:r>
+      <w:r>
+        <w:rPr>
+          <w:b/>
+          <w:bCs/>
+          <w:sz w:val="32"/>
+          <w:szCs w:val="32"/>
+        </w:rPr>
+        <w:t xml:space="preserve"> Strategy</w:t>
+      </w:r>
+    </w:p>
+    <w:p>
+      <w:pPr>
+        <w:rPr>
+          <w:b/>
+          <w:bCs/>
+          <w:sz w:val="22"/>
+          <w:szCs w:val="22"/>
+        </w:rPr>
+      </w:pPr>
+      <w:r>
+        <w:rPr>
+          <w:rFonts w:ascii="Segoe UI Emoji" w:hAnsi="Segoe UI Emoji" w:cs="Segoe UI Emoji"/>
+          <w:b/>
+          <w:bCs/>
+          <w:sz w:val="22"/>
+          <w:szCs w:val="22"/>
+        </w:rPr>
+        <w:t>🧱</w:t>
+      </w:r>
+      <w:r>
+        <w:rPr>
+          <w:b/>
+          <w:bCs/>
+          <w:sz w:val="22"/>
+          <w:szCs w:val="22"/>
+        </w:rPr>
+        <w:t xml:space="preserve"> Layout &amp; Page Structure Instructions</w:t>
+      </w:r>
+    </w:p>
+    <w:p>
+      <w:pPr>
+        <w:rPr>
+          <w:rFonts w:ascii="Segoe UI Emoji" w:hAnsi="Segoe UI Emoji" w:cs="Segoe UI Emoji"/>
+          <w:b/>
+          <w:bCs/>
+          <w:sz w:val="22"/>
+          <w:szCs w:val="22"/>
+        </w:rPr>
+      </w:pPr>
+      <w:r>
+        <w:rPr>
+          <w:rFonts w:ascii="Segoe UI Emoji" w:hAnsi="Segoe UI Emoji" w:cs="Segoe UI Emoji"/>
+          <w:b/>
+          <w:bCs/>
+          <w:sz w:val="22"/>
+          <w:szCs w:val="22"/>
+        </w:rPr>
+        <w:t>🔹 1. Footer Placement</w:t>
+      </w:r>
+    </w:p>
+    <w:p>
+      <w:pPr>
+        <w:pStyle w:val="ListParagraph"/>
+        <w:numPr>
+          <w:ilvl w:val="0"/>
+          <w:numId w:val="27"/>
+        </w:numPr>
+        <w:rPr>
+          <w:sz w:val="22"/>
+          <w:szCs w:val="22"/>
+        </w:rPr>
+      </w:pPr>
+      <w:r>
+        <w:rPr>
+          <w:sz w:val="22"/>
+          <w:szCs w:val="22"/>
+        </w:rPr>
+        <w:t>The footer should be anchored at the end of the content, not fixed to the viewport.</w:t>
+      </w:r>
+    </w:p>
+    <w:p>
+      <w:pPr>
+        <w:pStyle w:val="ListParagraph"/>
+        <w:numPr>
+          <w:ilvl w:val="0"/>
+          <w:numId w:val="27"/>
+        </w:numPr>
+        <w:rPr>
+          <w:sz w:val="22"/>
+          <w:szCs w:val="22"/>
+        </w:rPr>
+      </w:pPr>
+      <w:r>
+        <w:rPr>
+          <w:sz w:val="22"/>
+          <w:szCs w:val="22"/>
+        </w:rPr>
+        <w:t xml:space="preserve">Use layout containers </w:t>
+      </w:r>
+      <w:proofErr w:type="gramStart"/>
+      <w:r>
+        <w:rPr>
+          <w:sz w:val="22"/>
+          <w:szCs w:val="22"/>
+        </w:rPr>
+        <w:t>like  or</w:t>
+      </w:r>
+      <w:proofErr w:type="gramEnd"/>
+      <w:r>
+        <w:rPr>
+          <w:sz w:val="22"/>
+          <w:szCs w:val="22"/>
+        </w:rPr>
+        <w:t xml:space="preserve">  to ensure the footer naturally follows page content.</w:t>
+      </w:r>
+    </w:p>
+    <w:p>
+      <w:pPr>
+        <w:pStyle w:val="ListParagraph"/>
+        <w:numPr>
+          <w:ilvl w:val="0"/>
+          <w:numId w:val="27"/>
+        </w:numPr>
+        <w:rPr>
+          <w:sz w:val="22"/>
+          <w:szCs w:val="22"/>
+        </w:rPr>
+      </w:pPr>
+      <w:proofErr w:type="gramStart"/>
+      <w:r>
+        <w:rPr>
+          <w:sz w:val="22"/>
+          <w:szCs w:val="22"/>
+        </w:rPr>
+        <w:t>Avoid  unless</w:t>
+      </w:r>
+      <w:proofErr w:type="gramEnd"/>
+      <w:r>
+        <w:rPr>
+          <w:sz w:val="22"/>
+          <w:szCs w:val="22"/>
+        </w:rPr>
+        <w:t xml:space="preserve"> for floating elements (e.g. chat, promo CTA).</w:t>
+      </w:r>
+    </w:p>
+    <w:p>
+      <w:pPr>
+        <w:rPr>
+          <w:b/>
+          <w:bCs/>
+          <w:sz w:val="22"/>
+          <w:szCs w:val="22"/>
+        </w:rPr>
+      </w:pPr>
+      <w:r>
+        <w:rPr>
+          <w:rFonts w:ascii="Segoe UI Emoji" w:hAnsi="Segoe UI Emoji" w:cs="Segoe UI Emoji"/>
+          <w:b/>
+          <w:bCs/>
+          <w:sz w:val="22"/>
+          <w:szCs w:val="22"/>
+        </w:rPr>
+        <w:t>🔹</w:t>
+      </w:r>
+      <w:r>
+        <w:rPr>
+          <w:b/>
+          <w:bCs/>
+          <w:sz w:val="22"/>
+          <w:szCs w:val="22"/>
+        </w:rPr>
+        <w:t xml:space="preserve"> 2. Infinite Page Flow</w:t>
+      </w:r>
+    </w:p>
+    <w:p>
+      <w:pPr>
+        <w:pStyle w:val="ListParagraph"/>
+        <w:numPr>
+          <w:ilvl w:val="0"/>
+          <w:numId w:val="26"/>
+        </w:numPr>
+        <w:rPr>
+          <w:sz w:val="22"/>
+          <w:szCs w:val="22"/>
+        </w:rPr>
+      </w:pPr>
+      <w:r>
+        <w:rPr>
+          <w:sz w:val="22"/>
+          <w:szCs w:val="22"/>
+        </w:rPr>
+        <w:t>Pages should support infinite vertical scrolling where applicable (e.g. product listings, search results).</w:t>
+      </w:r>
+    </w:p>
+    <w:p>
+      <w:pPr>
+        <w:pStyle w:val="ListParagraph"/>
+        <w:numPr>
+          <w:ilvl w:val="0"/>
+          <w:numId w:val="26"/>
+        </w:numPr>
+        <w:rPr>
+          <w:sz w:val="22"/>
+          <w:szCs w:val="22"/>
+        </w:rPr>
+      </w:pPr>
+      <w:proofErr w:type="gramStart"/>
+      <w:r>
+        <w:rPr>
+          <w:sz w:val="22"/>
+          <w:szCs w:val="22"/>
+        </w:rPr>
+        <w:t>Use  on</w:t>
+      </w:r>
+      <w:proofErr w:type="gramEnd"/>
+      <w:r>
+        <w:rPr>
+          <w:sz w:val="22"/>
+          <w:szCs w:val="22"/>
+        </w:rPr>
+        <w:t xml:space="preserve"> scrollable containers and avoid hard height limits.</w:t>
+      </w:r>
+    </w:p>
+    <w:p>
+      <w:pPr>
+        <w:pStyle w:val="ListParagraph"/>
+        <w:numPr>
+          <w:ilvl w:val="0"/>
+          <w:numId w:val="26"/>
+        </w:numPr>
+        <w:rPr>
+          <w:sz w:val="22"/>
+          <w:szCs w:val="22"/>
+        </w:rPr>
+      </w:pPr>
+      <w:r>
+        <w:rPr>
+          <w:sz w:val="22"/>
+          <w:szCs w:val="22"/>
+        </w:rPr>
+        <w:t xml:space="preserve">Ensure the footer does not block or </w:t>
+      </w:r>
+      <w:proofErr w:type="gramStart"/>
+      <w:r>
+        <w:rPr>
+          <w:sz w:val="22"/>
+          <w:szCs w:val="22"/>
+        </w:rPr>
+        <w:t>overlap</w:t>
+      </w:r>
+      <w:proofErr w:type="gramEnd"/>
+      <w:r>
+        <w:rPr>
+          <w:sz w:val="22"/>
+          <w:szCs w:val="22"/>
+        </w:rPr>
+        <w:t xml:space="preserve"> dynamic content loading.</w:t>
+      </w:r>
+    </w:p>
+    <w:p>
+      <w:pPr>
+        <w:rPr>
+          <w:b/>
+          <w:bCs/>
+          <w:sz w:val="22"/>
+          <w:szCs w:val="22"/>
+        </w:rPr>
+      </w:pPr>
+      <w:r>
+        <w:rPr>
+          <w:b/>
+          <w:bCs/>
+          <w:sz w:val="22"/>
+          <w:szCs w:val="22"/>
+        </w:rPr>
+        <w:t>3. Responsive Grid Behavior</w:t>
+      </w:r>
+    </w:p>
+    <w:p>
+      <w:pPr>
+        <w:pStyle w:val="ListParagraph"/>
+        <w:numPr>
+          <w:ilvl w:val="0"/>
+          <w:numId w:val="25"/>
+        </w:numPr>
+        <w:rPr>
+          <w:sz w:val="22"/>
+          <w:szCs w:val="22"/>
+        </w:rPr>
+      </w:pPr>
+      <w:r>
+        <w:rPr>
+          <w:sz w:val="22"/>
+          <w:szCs w:val="22"/>
+        </w:rPr>
+        <w:t>Use CSS Grid or Flexbox to define footer colu</w:t>
+      </w:r>
+      <w:r>
+        <w:rPr>
+          <w:sz w:val="22"/>
+          <w:szCs w:val="22"/>
+        </w:rPr>
+        <w:t>mn</w:t>
+      </w:r>
+    </w:p>
+    <w:p>
+      <w:pPr>
+        <w:pStyle w:val="ListParagraph"/>
+        <w:numPr>
+          <w:ilvl w:val="0"/>
+          <w:numId w:val="25"/>
+        </w:numPr>
+        <w:rPr>
+          <w:sz w:val="22"/>
+          <w:szCs w:val="22"/>
+        </w:rPr>
+      </w:pPr>
+      <w:r>
+        <w:rPr>
+          <w:sz w:val="22"/>
+          <w:szCs w:val="22"/>
+        </w:rPr>
+        <w:t>On smaller screens, columns should collapse into stacked sections using media queries</w:t>
+      </w:r>
+    </w:p>
+    <w:p>
+      <w:pPr>
+        <w:rPr>
+          <w:b/>
+          <w:bCs/>
+          <w:sz w:val="22"/>
+          <w:szCs w:val="22"/>
+        </w:rPr>
+      </w:pPr>
+      <w:r>
+        <w:rPr>
+          <w:b/>
+          <w:bCs/>
+          <w:sz w:val="22"/>
+          <w:szCs w:val="22"/>
+        </w:rPr>
+        <w:t>4. Mobile Collapse Behavior</w:t>
+      </w:r>
+    </w:p>
+    <w:p>
+      <w:pPr>
+        <w:pStyle w:val="ListParagraph"/>
+        <w:numPr>
+          <w:ilvl w:val="0"/>
+          <w:numId w:val="28"/>
+        </w:numPr>
+        <w:rPr>
+          <w:sz w:val="22"/>
+          <w:szCs w:val="22"/>
+        </w:rPr>
+      </w:pPr>
+      <w:r>
+        <w:rPr>
+          <w:sz w:val="22"/>
+          <w:szCs w:val="22"/>
+        </w:rPr>
+        <w:t>Each footer section (e.g. “Explore Merkato”, “Help &amp; Support”) should collapse into accordion-style toggles on mobile:</w:t>
+      </w:r>
+    </w:p>
+    <w:p>
+      <w:pPr>
+        <w:pStyle w:val="ListParagraph"/>
+        <w:numPr>
+          <w:ilvl w:val="0"/>
+          <w:numId w:val="28"/>
+        </w:numPr>
+        <w:rPr>
+          <w:sz w:val="22"/>
+          <w:szCs w:val="22"/>
+        </w:rPr>
+      </w:pPr>
+      <w:proofErr w:type="gramStart"/>
+      <w:r>
+        <w:rPr>
+          <w:sz w:val="22"/>
+          <w:szCs w:val="22"/>
+        </w:rPr>
+        <w:t>Use  and</w:t>
+      </w:r>
+      <w:proofErr w:type="gramEnd"/>
+      <w:r>
+        <w:rPr>
+          <w:sz w:val="22"/>
+          <w:szCs w:val="22"/>
+        </w:rPr>
+        <w:t xml:space="preserve">  tags or custom collapsible components</w:t>
+      </w:r>
+    </w:p>
+    <w:p>
+      <w:pPr>
+        <w:pStyle w:val="ListParagraph"/>
+        <w:numPr>
+          <w:ilvl w:val="0"/>
+          <w:numId w:val="28"/>
+        </w:numPr>
+        <w:rPr>
+          <w:sz w:val="22"/>
+          <w:szCs w:val="22"/>
+        </w:rPr>
+      </w:pPr>
+      <w:r>
+        <w:rPr>
+          <w:sz w:val="22"/>
+          <w:szCs w:val="22"/>
+        </w:rPr>
+        <w:t>Ensure keyboard accessibility and clear visual indicators</w:t>
+      </w:r>
+    </w:p>
+    <w:p>
+      <w:pPr>
+        <w:pStyle w:val="ListParagraph"/>
+        <w:rPr>
+          <w:sz w:val="22"/>
+          <w:szCs w:val="22"/>
+        </w:rPr>
+      </w:pPr>
+    </w:p>
+    <w:p>
+      <w:pPr>
+        <w:rPr>
+          <w:b/>
+          <w:bCs/>
+          <w:sz w:val="22"/>
+          <w:szCs w:val="22"/>
+        </w:rPr>
+      </w:pPr>
+      <w:r>
+        <w:rPr>
+          <w:b/>
+          <w:bCs/>
+          <w:sz w:val="22"/>
+          <w:szCs w:val="22"/>
+        </w:rPr>
+        <w:t xml:space="preserve">5. </w:t>
+      </w:r>
+      <w:r>
+        <w:rPr>
+          <w:b/>
+          <w:bCs/>
+          <w:sz w:val="22"/>
+          <w:szCs w:val="22"/>
+        </w:rPr>
+        <w:t>Sticky Elements (Optional)</w:t>
+      </w:r>
+    </w:p>
+    <w:p>
+      <w:pPr>
+        <w:pStyle w:val="ListParagraph"/>
+        <w:numPr>
+          <w:ilvl w:val="0"/>
+          <w:numId w:val="29"/>
+        </w:numPr>
+        <w:rPr>
+          <w:sz w:val="22"/>
+          <w:szCs w:val="22"/>
+        </w:rPr>
+      </w:pPr>
+      <w:r>
+        <w:rPr>
+          <w:sz w:val="22"/>
+          <w:szCs w:val="22"/>
+        </w:rPr>
+        <w:t>Use sticky top navbars for persistent access to search, categories, and cart</w:t>
+      </w:r>
+    </w:p>
+    <w:p>
+      <w:pPr>
+        <w:pStyle w:val="ListParagraph"/>
+        <w:numPr>
+          <w:ilvl w:val="0"/>
+          <w:numId w:val="29"/>
+        </w:numPr>
+        <w:rPr>
+          <w:sz w:val="22"/>
+          <w:szCs w:val="22"/>
+        </w:rPr>
+      </w:pPr>
+      <w:r>
+        <w:rPr>
+          <w:sz w:val="22"/>
+          <w:szCs w:val="22"/>
+        </w:rPr>
+        <w:t>Avoid sticky footers unless for floating CTAs (e.g. “Add to Cart”, “Chat with Support”)</w:t>
+      </w:r>
+    </w:p>
+    <w:p>
+      <w:pPr>
+        <w:pStyle w:val="ListParagraph"/>
+        <w:rPr>
+          <w:sz w:val="22"/>
+          <w:szCs w:val="22"/>
+        </w:rPr>
+      </w:pPr>
+    </w:p>
+    <w:p>
+      <w:pPr>
+        <w:rPr>
+          <w:b/>
+          <w:bCs/>
+          <w:sz w:val="22"/>
+          <w:szCs w:val="22"/>
+        </w:rPr>
+      </w:pPr>
+      <w:r>
+        <w:rPr>
+          <w:b/>
+          <w:bCs/>
+          <w:sz w:val="22"/>
+          <w:szCs w:val="22"/>
+        </w:rPr>
+        <w:lastRenderedPageBreak/>
+        <w:t xml:space="preserve">6. </w:t>
+      </w:r>
+      <w:r>
+        <w:rPr>
+          <w:b/>
+          <w:bCs/>
+          <w:sz w:val="22"/>
+          <w:szCs w:val="22"/>
+        </w:rPr>
+        <w:t>Strategic Notes</w:t>
+      </w:r>
+    </w:p>
+    <w:p>
+      <w:pPr>
+        <w:pStyle w:val="ListParagraph"/>
+        <w:numPr>
+          <w:ilvl w:val="0"/>
+          <w:numId w:val="30"/>
+        </w:numPr>
+        <w:rPr>
+          <w:sz w:val="22"/>
+          <w:szCs w:val="22"/>
+        </w:rPr>
+      </w:pPr>
+      <w:r>
+        <w:rPr>
+          <w:sz w:val="22"/>
+          <w:szCs w:val="22"/>
+        </w:rPr>
+        <w:t>Footer should scale with content, not constrain it</w:t>
+      </w:r>
+    </w:p>
+    <w:p>
+      <w:pPr>
+        <w:pStyle w:val="ListParagraph"/>
+        <w:numPr>
+          <w:ilvl w:val="0"/>
+          <w:numId w:val="30"/>
+        </w:numPr>
+        <w:rPr>
+          <w:sz w:val="22"/>
+          <w:szCs w:val="22"/>
+        </w:rPr>
+      </w:pPr>
+      <w:r>
+        <w:rPr>
+          <w:sz w:val="22"/>
+          <w:szCs w:val="22"/>
+        </w:rPr>
+        <w:t>Mobile-first design ensures usability across all devices</w:t>
+      </w:r>
+    </w:p>
+    <w:p>
+      <w:pPr>
+        <w:pStyle w:val="ListParagraph"/>
+        <w:numPr>
+          <w:ilvl w:val="0"/>
+          <w:numId w:val="30"/>
+        </w:numPr>
+        <w:rPr>
+          <w:sz w:val="22"/>
+          <w:szCs w:val="22"/>
+        </w:rPr>
+      </w:pPr>
+      <w:r>
+        <w:rPr>
+          <w:sz w:val="22"/>
+          <w:szCs w:val="22"/>
+        </w:rPr>
+        <w:t>Infinite scroll should be paired with lazy loading and scroll anchors for performance</w:t>
+      </w:r>
+    </w:p>
+    <w:p>
+      <w:pPr>
+        <w:pStyle w:val="ListParagraph"/>
+        <w:numPr>
+          <w:ilvl w:val="0"/>
+          <w:numId w:val="30"/>
+        </w:numPr>
+        <w:rPr>
+          <w:sz w:val="22"/>
+          <w:szCs w:val="22"/>
+        </w:rPr>
+      </w:pPr>
+      <w:r>
+        <w:rPr>
+          <w:sz w:val="22"/>
+          <w:szCs w:val="22"/>
+        </w:rPr>
+        <w:t>Role-based visibility logic ensures each user sees relevant links without clutter</w:t>
+      </w:r>
+    </w:p>
+    <w:p>
+      <w:pPr>
+        <w:pStyle w:val="ListParagraph"/>
+        <w:rPr>
+          <w:sz w:val="22"/>
+          <w:szCs w:val="22"/>
+        </w:rPr>
+      </w:pPr>
+    </w:p>
+    <w:p>
+      <w:pPr>
+        <w:pStyle w:val="ListParagraph"/>
+        <w:numPr>
+          <w:ilvl w:val="0"/>
+          <w:numId w:val="24"/>
+        </w:numPr>
+        <w:rPr>
+          <w:b/>
+          <w:bCs/>
+          <w:sz w:val="22"/>
+          <w:szCs w:val="22"/>
+        </w:rPr>
+      </w:pPr>
+      <w:r>
+        <w:rPr>
+          <w:b/>
+          <w:bCs/>
+          <w:sz w:val="22"/>
+          <w:szCs w:val="22"/>
+        </w:rPr>
+        <w:t>Universal Footer Structure (Visible to All Roles)</w:t>
+      </w:r>
+    </w:p>
+    <w:tbl>
+      <w:tblPr>
+        <w:tblW w:w="0" w:type="auto"/>
+        <w:tblCellSpacing w:w="15" w:type="dxa"/>
+        <w:tblCellMar>
+          <w:top w:w="15" w:type="dxa"/>
+          <w:left w:w="15" w:type="dxa"/>
+          <w:bottom w:w="15" w:type="dxa"/>
+          <w:right w:w="15" w:type="dxa"/>
+        </w:tblCellMar>
+        <w:tblLook w:val="04A0" w:firstRow="1" w:lastRow="0" w:firstColumn="1" w:lastColumn="0" w:noHBand="0" w:noVBand="1"/>
+      </w:tblPr>
+      <w:tblGrid>
+        <w:gridCol w:w="81"/>
+        <w:gridCol w:w="81"/>
+      </w:tblGrid>
+      <w:tr>
+        <w:trPr>
+          <w:tblHeader/>
+          <w:tblCellSpacing w:w="15" w:type="dxa"/>
+        </w:trPr>
+        <w:tc>
+          <w:tcPr>
+            <w:tcW w:w="0" w:type="auto"/>
+            <w:vAlign w:val="center"/>
+            <w:hideMark/>
+          </w:tcPr>
+          <w:p>
+            <w:pPr>
+              <w:rPr>
+                <w:sz w:val="22"/>
+                <w:szCs w:val="22"/>
+              </w:rPr>
+            </w:pPr>
+          </w:p>
+        </w:tc>
+        <w:tc>
+          <w:tcPr>
+            <w:tcW w:w="0" w:type="auto"/>
+            <w:vAlign w:val="center"/>
+            <w:hideMark/>
+          </w:tcPr>
+          <w:p>
+            <w:pPr>
+              <w:rPr>
+                <w:sz w:val="22"/>
+                <w:szCs w:val="22"/>
+              </w:rPr>
+            </w:pPr>
+          </w:p>
+        </w:tc>
+      </w:tr>
+      <w:tr>
+        <w:trPr>
+          <w:tblCellSpacing w:w="15" w:type="dxa"/>
+        </w:trPr>
+        <w:tc>
+          <w:tcPr>
+            <w:tcW w:w="0" w:type="auto"/>
+            <w:vAlign w:val="center"/>
+            <w:hideMark/>
+          </w:tcPr>
+          <w:p>
+            <w:pPr>
+              <w:rPr>
+                <w:sz w:val="22"/>
+                <w:szCs w:val="22"/>
+              </w:rPr>
+            </w:pPr>
+          </w:p>
+        </w:tc>
+        <w:tc>
+          <w:tcPr>
+            <w:tcW w:w="0" w:type="auto"/>
+            <w:vAlign w:val="center"/>
+            <w:hideMark/>
+          </w:tcPr>
+          <w:p>
+            <w:pPr>
+              <w:rPr>
+                <w:sz w:val="22"/>
+                <w:szCs w:val="22"/>
+              </w:rPr>
+            </w:pPr>
+          </w:p>
+        </w:tc>
+      </w:tr>
+      <w:tr>
+        <w:trPr>
+          <w:tblCellSpacing w:w="15" w:type="dxa"/>
+        </w:trPr>
+        <w:tc>
+          <w:tcPr>
+            <w:tcW w:w="0" w:type="auto"/>
+            <w:vAlign w:val="center"/>
+            <w:hideMark/>
+          </w:tcPr>
+          <w:p>
+            <w:pPr>
+              <w:rPr>
+                <w:sz w:val="22"/>
+                <w:szCs w:val="22"/>
+              </w:rPr>
+            </w:pPr>
+          </w:p>
+        </w:tc>
+        <w:tc>
+          <w:tcPr>
+            <w:tcW w:w="0" w:type="auto"/>
+            <w:vAlign w:val="center"/>
+            <w:hideMark/>
+          </w:tcPr>
+          <w:p>
+            <w:pPr>
+              <w:rPr>
+                <w:sz w:val="22"/>
+                <w:szCs w:val="22"/>
+              </w:rPr>
+            </w:pPr>
+          </w:p>
+        </w:tc>
+      </w:tr>
+    </w:tbl>
+    <w:p>
+      <w:pPr>
+        <w:pBdr>
+          <w:top w:val="single" w:sz="4" w:space="1" w:color="auto"/>
+          <w:left w:val="single" w:sz="4" w:space="4" w:color="auto"/>
+          <w:bottom w:val="single" w:sz="4" w:space="1" w:color="auto"/>
+          <w:right w:val="single" w:sz="4" w:space="4" w:color="auto"/>
+          <w:between w:val="single" w:sz="4" w:space="1" w:color="auto"/>
+          <w:bar w:val="single" w:sz="4" w:color="auto"/>
+        </w:pBdr>
+        <w:shd w:val="clear" w:color="auto" w:fill="00B0F0"/>
+        <w:rPr>
+          <w:sz w:val="22"/>
+          <w:szCs w:val="22"/>
+        </w:rPr>
+      </w:pPr>
+      <w:r>
+        <w:rPr>
+          <w:sz w:val="22"/>
+          <w:szCs w:val="22"/>
+        </w:rPr>
+        <w:t>Section</w:t>
+      </w:r>
+      <w:r>
+        <w:rPr>
+          <w:sz w:val="22"/>
+          <w:szCs w:val="22"/>
+        </w:rPr>
+        <w:tab/>
+      </w:r>
+      <w:r>
+        <w:rPr>
+          <w:sz w:val="22"/>
+          <w:szCs w:val="22"/>
+        </w:rPr>
+        <w:tab/>
+      </w:r>
+      <w:r>
+        <w:rPr>
+          <w:sz w:val="22"/>
+          <w:szCs w:val="22"/>
+        </w:rPr>
+        <w:tab/>
+      </w:r>
+      <w:r>
+        <w:rPr>
+          <w:sz w:val="22"/>
+          <w:szCs w:val="22"/>
+        </w:rPr>
+        <w:t>Links</w:t>
+      </w:r>
+    </w:p>
+    <w:p>
+      <w:pPr>
+        <w:pBdr>
+          <w:top w:val="single" w:sz="4" w:space="1" w:color="auto"/>
+          <w:left w:val="single" w:sz="4" w:space="4" w:color="auto"/>
+          <w:bottom w:val="single" w:sz="4" w:space="1" w:color="auto"/>
+          <w:right w:val="single" w:sz="4" w:space="4" w:color="auto"/>
+          <w:between w:val="single" w:sz="4" w:space="1" w:color="auto"/>
+          <w:bar w:val="single" w:sz="4" w:color="auto"/>
+        </w:pBdr>
+        <w:rPr>
+          <w:sz w:val="22"/>
+          <w:szCs w:val="22"/>
+        </w:rPr>
+      </w:pPr>
+      <w:r>
+        <w:rPr>
+          <w:sz w:val="22"/>
+          <w:szCs w:val="22"/>
+        </w:rPr>
+        <w:t>Explore Merkato</w:t>
+      </w:r>
+      <w:r>
+        <w:rPr>
+          <w:sz w:val="22"/>
+          <w:szCs w:val="22"/>
+        </w:rPr>
+        <w:tab/>
+        <w:t>About Us, Careers, Blog, Press, Telium Ecosystem</w:t>
+      </w:r>
+    </w:p>
+    <w:p>
+      <w:pPr>
+        <w:pBdr>
+          <w:top w:val="single" w:sz="4" w:space="1" w:color="auto"/>
+          <w:left w:val="single" w:sz="4" w:space="4" w:color="auto"/>
+          <w:bottom w:val="single" w:sz="4" w:space="1" w:color="auto"/>
+          <w:right w:val="single" w:sz="4" w:space="4" w:color="auto"/>
+          <w:between w:val="single" w:sz="4" w:space="1" w:color="auto"/>
+          <w:bar w:val="single" w:sz="4" w:color="auto"/>
+        </w:pBdr>
+        <w:rPr>
+          <w:sz w:val="22"/>
+          <w:szCs w:val="22"/>
+        </w:rPr>
+      </w:pPr>
+      <w:r>
+        <w:rPr>
+          <w:sz w:val="22"/>
+          <w:szCs w:val="22"/>
+        </w:rPr>
+        <w:t>Commerce Tools</w:t>
+      </w:r>
+      <w:r>
+        <w:rPr>
+          <w:sz w:val="22"/>
+          <w:szCs w:val="22"/>
+        </w:rPr>
+        <w:tab/>
+        <w:t>Browse Products, Categories, Deals, Gift Cards, Promo Manager</w:t>
+      </w:r>
+    </w:p>
+    <w:p>
+      <w:pPr>
+        <w:pBdr>
+          <w:top w:val="single" w:sz="4" w:space="1" w:color="auto"/>
+          <w:left w:val="single" w:sz="4" w:space="4" w:color="auto"/>
+          <w:bottom w:val="single" w:sz="4" w:space="1" w:color="auto"/>
+          <w:right w:val="single" w:sz="4" w:space="4" w:color="auto"/>
+          <w:between w:val="single" w:sz="4" w:space="1" w:color="auto"/>
+          <w:bar w:val="single" w:sz="4" w:color="auto"/>
+        </w:pBdr>
+        <w:rPr>
+          <w:sz w:val="22"/>
+          <w:szCs w:val="22"/>
+        </w:rPr>
+      </w:pPr>
+      <w:r>
+        <w:rPr>
+          <w:sz w:val="22"/>
+          <w:szCs w:val="22"/>
+        </w:rPr>
+        <w:t>Help &amp; Support</w:t>
+      </w:r>
+      <w:r>
+        <w:rPr>
+          <w:sz w:val="22"/>
+          <w:szCs w:val="22"/>
+        </w:rPr>
+        <w:tab/>
+        <w:t>Contact Us, Help Center, Returns &amp; Refunds, Accessibility, Privacy</w:t>
+      </w:r>
+    </w:p>
+    <w:p>
+      <w:pPr>
+        <w:pStyle w:val="ListParagraph"/>
+        <w:pBdr>
+          <w:top w:val="single" w:sz="4" w:space="1" w:color="auto"/>
+          <w:left w:val="single" w:sz="4" w:space="4" w:color="auto"/>
+          <w:bottom w:val="single" w:sz="4" w:space="1" w:color="auto"/>
+          <w:right w:val="single" w:sz="4" w:space="4" w:color="auto"/>
+          <w:between w:val="single" w:sz="4" w:space="1" w:color="auto"/>
+          <w:bar w:val="single" w:sz="4" w:color="auto"/>
+        </w:pBdr>
+        <w:ind w:left="0"/>
+        <w:rPr>
+          <w:sz w:val="22"/>
+          <w:szCs w:val="22"/>
+        </w:rPr>
+      </w:pPr>
+      <w:r>
+        <w:rPr>
+          <w:sz w:val="22"/>
+          <w:szCs w:val="22"/>
+        </w:rPr>
+        <w:t>Connect With Us</w:t>
+      </w:r>
+      <w:r>
+        <w:rPr>
+          <w:sz w:val="22"/>
+          <w:szCs w:val="22"/>
+        </w:rPr>
+        <w:tab/>
+        <w:t>Twitter, Facebook, Instagram, LinkedIn</w:t>
+      </w:r>
+    </w:p>
+    <w:p>
+      <w:pPr>
+        <w:pStyle w:val="ListParagraph"/>
+        <w:ind w:left="0"/>
+        <w:rPr>
+          <w:sz w:val="22"/>
+          <w:szCs w:val="22"/>
+        </w:rPr>
+      </w:pPr>
+    </w:p>
+    <w:p>
+      <w:pPr>
+        <w:pStyle w:val="ListParagraph"/>
+        <w:numPr>
+          <w:ilvl w:val="0"/>
+          <w:numId w:val="24"/>
+        </w:numPr>
+        <w:rPr>
+          <w:b/>
+          <w:bCs/>
+          <w:sz w:val="22"/>
+          <w:szCs w:val="22"/>
+        </w:rPr>
+      </w:pPr>
+      <w:r>
+        <w:rPr>
+          <w:b/>
+          <w:bCs/>
+          <w:sz w:val="22"/>
+          <w:szCs w:val="22"/>
+        </w:rPr>
+        <w:t>Public page footer wireframe</w:t>
+      </w:r>
+    </w:p>
+    <w:tbl>
+      <w:tblPr>
+        <w:tblW w:w="9360" w:type="dxa"/>
+        <w:tblInd w:w="-5" w:type="dxa"/>
+        <w:tblLook w:val="04A0" w:firstRow="1" w:lastRow="0" w:firstColumn="1" w:lastColumn="0" w:noHBand="0" w:noVBand="1"/>
+      </w:tblPr>
+      <w:tblGrid>
+        <w:gridCol w:w="1740"/>
+        <w:gridCol w:w="7620"/>
+      </w:tblGrid>
+      <w:tr>
+        <w:trPr>
+          <w:trHeight w:val="288"/>
+        </w:trPr>
+        <w:tc>
+          <w:tcPr>
+            <w:tcW w:w="1740" w:type="dxa"/>
+            <w:tcBorders>
+              <w:top w:val="single" w:sz="4" w:space="0" w:color="auto"/>
+              <w:left w:val="single" w:sz="4" w:space="0" w:color="auto"/>
+              <w:bottom w:val="single" w:sz="4" w:space="0" w:color="auto"/>
+              <w:right w:val="single" w:sz="4" w:space="0" w:color="auto"/>
+            </w:tcBorders>
+            <w:shd w:val="clear" w:color="auto" w:fill="00B0F0"/>
+            <w:vAlign w:val="bottom"/>
+            <w:hideMark/>
+          </w:tcPr>
+          <w:p>
+            <w:pPr>
+              <w:spacing w:after="0" w:line="240" w:lineRule="auto"/>
+              <w:rPr>
+                <w:rFonts w:ascii="Aptos Narrow" w:eastAsia="Times New Roman" w:hAnsi="Aptos Narrow" w:cs="Times New Roman"/>
+                <w:b/>
+                <w:bCs/>
+                <w:color w:val="000000"/>
+                <w:kern w:val="0"/>
+                <w:sz w:val="22"/>
+                <w:szCs w:val="22"/>
+                <w14:ligatures w14:val="none"/>
+              </w:rPr>
+            </w:pPr>
+            <w:r>
+              <w:rPr>
+                <w:rFonts w:ascii="Aptos Narrow" w:eastAsia="Times New Roman" w:hAnsi="Aptos Narrow" w:cs="Times New Roman"/>
+                <w:b/>
+                <w:bCs/>
+                <w:color w:val="000000"/>
+                <w:kern w:val="0"/>
+                <w:sz w:val="22"/>
+                <w:szCs w:val="22"/>
+                <w14:ligatures w14:val="none"/>
+              </w:rPr>
+              <w:t>Section</w:t>
+            </w:r>
+          </w:p>
+        </w:tc>
+        <w:tc>
+          <w:tcPr>
+            <w:tcW w:w="7620" w:type="dxa"/>
+            <w:tcBorders>
+              <w:top w:val="single" w:sz="4" w:space="0" w:color="auto"/>
+              <w:left w:val="nil"/>
+              <w:bottom w:val="single" w:sz="4" w:space="0" w:color="auto"/>
+              <w:right w:val="single" w:sz="4" w:space="0" w:color="auto"/>
+            </w:tcBorders>
+            <w:shd w:val="clear" w:color="auto" w:fill="00B0F0"/>
+            <w:vAlign w:val="bottom"/>
+            <w:hideMark/>
+          </w:tcPr>
+          <w:p>
+            <w:pPr>
+              <w:spacing w:after="0" w:line="240" w:lineRule="auto"/>
+              <w:rPr>
+                <w:rFonts w:ascii="Aptos Narrow" w:eastAsia="Times New Roman" w:hAnsi="Aptos Narrow" w:cs="Times New Roman"/>
+                <w:b/>
+                <w:bCs/>
+                <w:color w:val="000000"/>
+                <w:kern w:val="0"/>
+                <w:sz w:val="22"/>
+                <w:szCs w:val="22"/>
+                <w14:ligatures w14:val="none"/>
+              </w:rPr>
+            </w:pPr>
+          </w:p>
+          <w:p>
+            <w:pPr>
+              <w:spacing w:after="0" w:line="240" w:lineRule="auto"/>
+              <w:rPr>
+                <w:rFonts w:ascii="Aptos Narrow" w:eastAsia="Times New Roman" w:hAnsi="Aptos Narrow" w:cs="Times New Roman"/>
+                <w:b/>
+                <w:bCs/>
+                <w:color w:val="000000"/>
+                <w:kern w:val="0"/>
+                <w:sz w:val="22"/>
+                <w:szCs w:val="22"/>
+                <w14:ligatures w14:val="none"/>
+              </w:rPr>
+            </w:pPr>
+            <w:r>
+              <w:rPr>
+                <w:rFonts w:ascii="Aptos Narrow" w:eastAsia="Times New Roman" w:hAnsi="Aptos Narrow" w:cs="Times New Roman"/>
+                <w:b/>
+                <w:bCs/>
+                <w:color w:val="000000"/>
+                <w:kern w:val="0"/>
+                <w:sz w:val="22"/>
+                <w:szCs w:val="22"/>
+                <w14:ligatures w14:val="none"/>
+              </w:rPr>
+              <w:t>Links</w:t>
+            </w:r>
+          </w:p>
+          <w:p>
+            <w:pPr>
+              <w:spacing w:after="0" w:line="240" w:lineRule="auto"/>
+              <w:rPr>
+                <w:rFonts w:ascii="Aptos Narrow" w:eastAsia="Times New Roman" w:hAnsi="Aptos Narrow" w:cs="Times New Roman"/>
+                <w:b/>
+                <w:bCs/>
+                <w:color w:val="000000"/>
+                <w:kern w:val="0"/>
+                <w:sz w:val="22"/>
+                <w:szCs w:val="22"/>
+                <w14:ligatures w14:val="none"/>
+              </w:rPr>
+            </w:pPr>
+          </w:p>
+        </w:tc>
+      </w:tr>
+      <w:tr>
+        <w:trPr>
+          <w:trHeight w:val="576"/>
+        </w:trPr>
+        <w:tc>
+          <w:tcPr>
+            <w:tcW w:w="1740" w:type="dxa"/>
+            <w:tcBorders>
+              <w:top w:val="nil"/>
+              <w:left w:val="single" w:sz="4" w:space="0" w:color="auto"/>
+              <w:bottom w:val="single" w:sz="4" w:space="0" w:color="auto"/>
+              <w:right w:val="single" w:sz="4" w:space="0" w:color="auto"/>
+            </w:tcBorders>
+            <w:vAlign w:val="bottom"/>
+            <w:hideMark/>
+          </w:tcPr>
+          <w:p>
+            <w:pPr>
+              <w:spacing w:after="0" w:line="240" w:lineRule="auto"/>
+              <w:rPr>
+                <w:rFonts w:ascii="Aptos Narrow" w:eastAsia="Times New Roman" w:hAnsi="Aptos Narrow" w:cs="Times New Roman"/>
+                <w:color w:val="000000"/>
+                <w:kern w:val="0"/>
+                <w:sz w:val="22"/>
+                <w:szCs w:val="22"/>
+                <w14:ligatures w14:val="none"/>
+              </w:rPr>
+            </w:pPr>
+            <w:r>
+              <w:rPr>
+                <w:rFonts w:ascii="Aptos Narrow" w:eastAsia="Times New Roman" w:hAnsi="Aptos Narrow" w:cs="Times New Roman"/>
+                <w:color w:val="000000"/>
+                <w:kern w:val="0"/>
+                <w:sz w:val="22"/>
+                <w:szCs w:val="22"/>
+                <w14:ligatures w14:val="none"/>
+              </w:rPr>
+              <w:t>Explore Merkato</w:t>
+            </w:r>
+          </w:p>
+        </w:tc>
+        <w:tc>
+          <w:tcPr>
+            <w:tcW w:w="7620" w:type="dxa"/>
+            <w:tcBorders>
+              <w:top w:val="nil"/>
+              <w:left w:val="nil"/>
+              <w:bottom w:val="single" w:sz="4" w:space="0" w:color="auto"/>
+              <w:right w:val="single" w:sz="4" w:space="0" w:color="auto"/>
+            </w:tcBorders>
+            <w:vAlign w:val="bottom"/>
+            <w:hideMark/>
+          </w:tcPr>
+          <w:p>
+            <w:pPr>
+              <w:spacing w:after="0" w:line="240" w:lineRule="auto"/>
+              <w:rPr>
+                <w:rFonts w:ascii="Aptos Narrow" w:eastAsia="Times New Roman" w:hAnsi="Aptos Narrow" w:cs="Times New Roman"/>
+                <w:color w:val="000000"/>
+                <w:kern w:val="0"/>
+                <w:sz w:val="22"/>
+                <w:szCs w:val="22"/>
+                <w14:ligatures w14:val="none"/>
+              </w:rPr>
+            </w:pPr>
+            <w:r>
+              <w:rPr>
+                <w:rFonts w:ascii="Aptos Narrow" w:eastAsia="Times New Roman" w:hAnsi="Aptos Narrow" w:cs="Times New Roman"/>
+                <w:color w:val="000000"/>
+                <w:kern w:val="0"/>
+                <w:sz w:val="22"/>
+                <w:szCs w:val="22"/>
+                <w14:ligatures w14:val="none"/>
+              </w:rPr>
+              <w:t>About Us, Careers, Blog, Press, Telium Ecosystem</w:t>
+            </w:r>
+          </w:p>
+        </w:tc>
+      </w:tr>
+      <w:tr>
+        <w:trPr>
+          <w:trHeight w:val="576"/>
+        </w:trPr>
+        <w:tc>
+          <w:tcPr>
+            <w:tcW w:w="1740" w:type="dxa"/>
+            <w:tcBorders>
+              <w:top w:val="nil"/>
+              <w:left w:val="single" w:sz="4" w:space="0" w:color="auto"/>
+              <w:bottom w:val="single" w:sz="4" w:space="0" w:color="auto"/>
+              <w:right w:val="single" w:sz="4" w:space="0" w:color="auto"/>
+            </w:tcBorders>
+            <w:vAlign w:val="bottom"/>
+            <w:hideMark/>
+          </w:tcPr>
+          <w:p>
+            <w:pPr>
+              <w:spacing w:after="0" w:line="240" w:lineRule="auto"/>
+              <w:rPr>
+                <w:rFonts w:ascii="Aptos Narrow" w:eastAsia="Times New Roman" w:hAnsi="Aptos Narrow" w:cs="Times New Roman"/>
+                <w:color w:val="000000"/>
+                <w:kern w:val="0"/>
+                <w:sz w:val="22"/>
+                <w:szCs w:val="22"/>
+                <w14:ligatures w14:val="none"/>
+              </w:rPr>
+            </w:pPr>
+            <w:r>
+              <w:rPr>
+                <w:rFonts w:ascii="Aptos Narrow" w:eastAsia="Times New Roman" w:hAnsi="Aptos Narrow" w:cs="Times New Roman"/>
+                <w:color w:val="000000"/>
+                <w:kern w:val="0"/>
+                <w:sz w:val="22"/>
+                <w:szCs w:val="22"/>
+                <w14:ligatures w14:val="none"/>
+              </w:rPr>
+              <w:t>Commerce Tools</w:t>
+            </w:r>
+          </w:p>
+        </w:tc>
+        <w:tc>
+          <w:tcPr>
+            <w:tcW w:w="7620" w:type="dxa"/>
+            <w:tcBorders>
+              <w:top w:val="nil"/>
+              <w:left w:val="nil"/>
+              <w:bottom w:val="single" w:sz="4" w:space="0" w:color="auto"/>
+              <w:right w:val="single" w:sz="4" w:space="0" w:color="auto"/>
+            </w:tcBorders>
+            <w:vAlign w:val="bottom"/>
+            <w:hideMark/>
+          </w:tcPr>
+          <w:p>
+            <w:pPr>
+              <w:spacing w:after="0" w:line="240" w:lineRule="auto"/>
+              <w:rPr>
+                <w:rFonts w:ascii="Aptos Narrow" w:eastAsia="Times New Roman" w:hAnsi="Aptos Narrow" w:cs="Times New Roman"/>
+                <w:color w:val="000000"/>
+                <w:kern w:val="0"/>
+                <w:sz w:val="22"/>
+                <w:szCs w:val="22"/>
+                <w14:ligatures w14:val="none"/>
+              </w:rPr>
+            </w:pPr>
+            <w:r>
+              <w:rPr>
+                <w:rFonts w:ascii="Aptos Narrow" w:eastAsia="Times New Roman" w:hAnsi="Aptos Narrow" w:cs="Times New Roman"/>
+                <w:color w:val="000000"/>
+                <w:kern w:val="0"/>
+                <w:sz w:val="22"/>
+                <w:szCs w:val="22"/>
+                <w14:ligatures w14:val="none"/>
+              </w:rPr>
+              <w:t>Browse Products, Categories, Deals, Gift Cards, Promo Manager</w:t>
+            </w:r>
+          </w:p>
+        </w:tc>
+      </w:tr>
+      <w:tr>
+        <w:trPr>
+          <w:trHeight w:val="576"/>
+        </w:trPr>
+        <w:tc>
+          <w:tcPr>
+            <w:tcW w:w="1740" w:type="dxa"/>
+            <w:tcBorders>
+              <w:top w:val="nil"/>
+              <w:left w:val="single" w:sz="4" w:space="0" w:color="auto"/>
+              <w:bottom w:val="single" w:sz="4" w:space="0" w:color="auto"/>
+              <w:right w:val="single" w:sz="4" w:space="0" w:color="auto"/>
+            </w:tcBorders>
+            <w:vAlign w:val="bottom"/>
+            <w:hideMark/>
+          </w:tcPr>
+          <w:p>
+            <w:pPr>
+              <w:spacing w:after="0" w:line="240" w:lineRule="auto"/>
+              <w:rPr>
+                <w:rFonts w:ascii="Aptos Narrow" w:eastAsia="Times New Roman" w:hAnsi="Aptos Narrow" w:cs="Times New Roman"/>
+                <w:color w:val="000000"/>
+                <w:kern w:val="0"/>
+                <w:sz w:val="22"/>
+                <w:szCs w:val="22"/>
+                <w14:ligatures w14:val="none"/>
+              </w:rPr>
+            </w:pPr>
+            <w:r>
+              <w:rPr>
+                <w:rFonts w:ascii="Aptos Narrow" w:eastAsia="Times New Roman" w:hAnsi="Aptos Narrow" w:cs="Times New Roman"/>
+                <w:color w:val="000000"/>
+                <w:kern w:val="0"/>
+                <w:sz w:val="22"/>
+                <w:szCs w:val="22"/>
+                <w14:ligatures w14:val="none"/>
+              </w:rPr>
+              <w:t>Help &amp; Support</w:t>
+            </w:r>
+          </w:p>
+        </w:tc>
+        <w:tc>
+          <w:tcPr>
+            <w:tcW w:w="7620" w:type="dxa"/>
+            <w:tcBorders>
+              <w:top w:val="nil"/>
+              <w:left w:val="nil"/>
+              <w:bottom w:val="single" w:sz="4" w:space="0" w:color="auto"/>
+              <w:right w:val="single" w:sz="4" w:space="0" w:color="auto"/>
+            </w:tcBorders>
+            <w:vAlign w:val="bottom"/>
+            <w:hideMark/>
+          </w:tcPr>
+          <w:p>
+            <w:pPr>
+              <w:spacing w:after="0" w:line="240" w:lineRule="auto"/>
+              <w:rPr>
+                <w:rFonts w:ascii="Aptos Narrow" w:eastAsia="Times New Roman" w:hAnsi="Aptos Narrow" w:cs="Times New Roman"/>
+                <w:color w:val="000000"/>
+                <w:kern w:val="0"/>
+                <w:sz w:val="22"/>
+                <w:szCs w:val="22"/>
+                <w14:ligatures w14:val="none"/>
+              </w:rPr>
+            </w:pPr>
+            <w:r>
+              <w:rPr>
+                <w:rFonts w:ascii="Aptos Narrow" w:eastAsia="Times New Roman" w:hAnsi="Aptos Narrow" w:cs="Times New Roman"/>
+                <w:color w:val="000000"/>
+                <w:kern w:val="0"/>
+                <w:sz w:val="22"/>
+                <w:szCs w:val="22"/>
+                <w14:ligatures w14:val="none"/>
+              </w:rPr>
+              <w:t>Contact Us, Help Center, Returns &amp; Refunds, Accessibility, Privacy</w:t>
+            </w:r>
+          </w:p>
+        </w:tc>
+      </w:tr>
+      <w:tr>
+        <w:trPr>
+          <w:trHeight w:val="288"/>
+        </w:trPr>
+        <w:tc>
+          <w:tcPr>
+            <w:tcW w:w="1740" w:type="dxa"/>
+            <w:tcBorders>
+              <w:top w:val="nil"/>
+              <w:left w:val="single" w:sz="4" w:space="0" w:color="auto"/>
+              <w:bottom w:val="single" w:sz="4" w:space="0" w:color="auto"/>
+              <w:right w:val="single" w:sz="4" w:space="0" w:color="auto"/>
+            </w:tcBorders>
+            <w:vAlign w:val="bottom"/>
+            <w:hideMark/>
+          </w:tcPr>
+          <w:p>
+            <w:pPr>
+              <w:spacing w:after="0" w:line="240" w:lineRule="auto"/>
+              <w:rPr>
+                <w:rFonts w:ascii="Aptos Narrow" w:eastAsia="Times New Roman" w:hAnsi="Aptos Narrow" w:cs="Times New Roman"/>
+                <w:color w:val="000000"/>
+                <w:kern w:val="0"/>
+                <w:sz w:val="22"/>
+                <w:szCs w:val="22"/>
+                <w14:ligatures w14:val="none"/>
+              </w:rPr>
+            </w:pPr>
+            <w:r>
+              <w:rPr>
+                <w:rFonts w:ascii="Aptos Narrow" w:eastAsia="Times New Roman" w:hAnsi="Aptos Narrow" w:cs="Times New Roman"/>
+                <w:color w:val="000000"/>
+                <w:kern w:val="0"/>
+                <w:sz w:val="22"/>
+                <w:szCs w:val="22"/>
+                <w14:ligatures w14:val="none"/>
+              </w:rPr>
+              <w:t>Connect With Us</w:t>
+            </w:r>
+          </w:p>
+        </w:tc>
+        <w:tc>
+          <w:tcPr>
+            <w:tcW w:w="7620" w:type="dxa"/>
+            <w:tcBorders>
+              <w:top w:val="nil"/>
+              <w:left w:val="nil"/>
+              <w:bottom w:val="single" w:sz="4" w:space="0" w:color="auto"/>
+              <w:right w:val="single" w:sz="4" w:space="0" w:color="auto"/>
+            </w:tcBorders>
+            <w:vAlign w:val="bottom"/>
+            <w:hideMark/>
+          </w:tcPr>
+          <w:p>
+            <w:pPr>
+              <w:spacing w:after="0" w:line="240" w:lineRule="auto"/>
+              <w:rPr>
+                <w:rFonts w:ascii="Aptos Narrow" w:eastAsia="Times New Roman" w:hAnsi="Aptos Narrow" w:cs="Times New Roman"/>
+                <w:color w:val="000000"/>
+                <w:kern w:val="0"/>
+                <w:sz w:val="22"/>
+                <w:szCs w:val="22"/>
+                <w14:ligatures w14:val="none"/>
+              </w:rPr>
+            </w:pPr>
+            <w:r>
+              <w:rPr>
+                <w:rFonts w:ascii="Aptos Narrow" w:eastAsia="Times New Roman" w:hAnsi="Aptos Narrow" w:cs="Times New Roman"/>
+                <w:color w:val="000000"/>
+                <w:kern w:val="0"/>
+                <w:sz w:val="22"/>
+                <w:szCs w:val="22"/>
+                <w14:ligatures w14:val="none"/>
+              </w:rPr>
+              <w:t>Twitter, Facebook, Instagram, LinkedIn</w:t>
+            </w:r>
+          </w:p>
+        </w:tc>
+      </w:tr>
+    </w:tbl>
+    <w:p>
+      <w:pPr>
+        <w:pStyle w:val="ListParagraph"/>
+        <w:numPr>
+          <w:ilvl w:val="0"/>
+          <w:numId w:val="24"/>
+        </w:numPr>
+        <w:rPr>
+          <w:b/>
+          <w:bCs/>
+          <w:sz w:val="22"/>
+          <w:szCs w:val="22"/>
+        </w:rPr>
+      </w:pPr>
+      <w:r>
+        <w:rPr>
+          <w:b/>
+          <w:bCs/>
+          <w:sz w:val="22"/>
+          <w:szCs w:val="22"/>
+        </w:rPr>
+        <w:t>Customer Page Footer Wireframe</w:t>
+      </w:r>
+    </w:p>
+    <w:p>
+      <w:pPr>
+        <w:pBdr>
+          <w:top w:val="single" w:sz="4" w:space="1" w:color="auto"/>
+          <w:left w:val="single" w:sz="4" w:space="4" w:color="auto"/>
+          <w:bottom w:val="single" w:sz="4" w:space="1" w:color="auto"/>
+          <w:right w:val="single" w:sz="4" w:space="4" w:color="auto"/>
+          <w:between w:val="single" w:sz="4" w:space="1" w:color="auto"/>
+          <w:bar w:val="single" w:sz="4" w:color="auto"/>
+        </w:pBdr>
+        <w:shd w:val="clear" w:color="auto" w:fill="00B0F0"/>
+        <w:rPr>
+          <w:b/>
+          <w:bCs/>
+          <w:sz w:val="22"/>
+          <w:szCs w:val="22"/>
+        </w:rPr>
+      </w:pPr>
+      <w:r>
+        <w:rPr>
+          <w:b/>
+          <w:bCs/>
+          <w:sz w:val="22"/>
+          <w:szCs w:val="22"/>
+        </w:rPr>
+        <w:t>Section</w:t>
+      </w:r>
+      <w:r>
+        <w:rPr>
+          <w:b/>
+          <w:bCs/>
+          <w:sz w:val="22"/>
+          <w:szCs w:val="22"/>
+        </w:rPr>
+        <w:tab/>
+      </w:r>
+      <w:r>
+        <w:rPr>
+          <w:b/>
+          <w:bCs/>
+          <w:sz w:val="22"/>
+          <w:szCs w:val="22"/>
+        </w:rPr>
+        <w:tab/>
+      </w:r>
+      <w:r>
+        <w:rPr>
+          <w:b/>
+          <w:bCs/>
+          <w:sz w:val="22"/>
+          <w:szCs w:val="22"/>
+        </w:rPr>
+        <w:tab/>
+      </w:r>
+      <w:r>
+        <w:rPr>
+          <w:b/>
+          <w:bCs/>
+          <w:sz w:val="22"/>
+          <w:szCs w:val="22"/>
+        </w:rPr>
+        <w:tab/>
+      </w:r>
+      <w:r>
+        <w:rPr>
+          <w:b/>
+          <w:bCs/>
+          <w:sz w:val="22"/>
+          <w:szCs w:val="22"/>
+        </w:rPr>
+        <w:t>Links</w:t>
+      </w:r>
+    </w:p>
+    <w:p>
+      <w:pPr>
+        <w:pBdr>
+          <w:top w:val="single" w:sz="4" w:space="1" w:color="auto"/>
+          <w:left w:val="single" w:sz="4" w:space="4" w:color="auto"/>
+          <w:bottom w:val="single" w:sz="4" w:space="1" w:color="auto"/>
+          <w:right w:val="single" w:sz="4" w:space="4" w:color="auto"/>
+          <w:between w:val="single" w:sz="4" w:space="1" w:color="auto"/>
+          <w:bar w:val="single" w:sz="4" w:color="auto"/>
+        </w:pBdr>
+        <w:rPr>
+          <w:b/>
+          <w:bCs/>
+          <w:sz w:val="22"/>
+          <w:szCs w:val="22"/>
+        </w:rPr>
+      </w:pPr>
+      <w:r>
+        <w:rPr>
+          <w:b/>
+          <w:bCs/>
+          <w:sz w:val="22"/>
+          <w:szCs w:val="22"/>
+        </w:rPr>
+        <w:t>Explore Merkato</w:t>
+      </w:r>
+      <w:r>
+        <w:rPr>
+          <w:b/>
+          <w:bCs/>
+          <w:sz w:val="22"/>
+          <w:szCs w:val="22"/>
+        </w:rPr>
+        <w:t>:</w:t>
+      </w:r>
+      <w:r>
+        <w:rPr>
+          <w:b/>
+          <w:bCs/>
+          <w:sz w:val="22"/>
+          <w:szCs w:val="22"/>
+        </w:rPr>
+        <w:tab/>
+      </w:r>
+      <w:r>
+        <w:rPr>
+          <w:sz w:val="22"/>
+          <w:szCs w:val="22"/>
+        </w:rPr>
+        <w:t>About Us, Careers, Blog, Press, Telium Ecosystem</w:t>
+      </w:r>
+    </w:p>
+    <w:p>
+      <w:pPr>
+        <w:pBdr>
+          <w:top w:val="single" w:sz="4" w:space="1" w:color="auto"/>
+          <w:left w:val="single" w:sz="4" w:space="4" w:color="auto"/>
+          <w:bottom w:val="single" w:sz="4" w:space="1" w:color="auto"/>
+          <w:right w:val="single" w:sz="4" w:space="4" w:color="auto"/>
+          <w:between w:val="single" w:sz="4" w:space="1" w:color="auto"/>
+          <w:bar w:val="single" w:sz="4" w:color="auto"/>
+        </w:pBdr>
+        <w:rPr>
+          <w:b/>
+          <w:bCs/>
+          <w:sz w:val="22"/>
+          <w:szCs w:val="22"/>
+        </w:rPr>
+      </w:pPr>
+      <w:r>
+        <w:rPr>
+          <w:b/>
+          <w:bCs/>
+          <w:sz w:val="22"/>
+          <w:szCs w:val="22"/>
+        </w:rPr>
+        <w:t>Your Account</w:t>
+      </w:r>
+      <w:r>
+        <w:rPr>
+          <w:b/>
+          <w:bCs/>
+          <w:sz w:val="22"/>
+          <w:szCs w:val="22"/>
+        </w:rPr>
+        <w:t xml:space="preserve">: </w:t>
+      </w:r>
+      <w:r>
+        <w:rPr>
+          <w:b/>
+          <w:bCs/>
+          <w:sz w:val="22"/>
+          <w:szCs w:val="22"/>
+        </w:rPr>
+        <w:tab/>
+      </w:r>
+      <w:r>
+        <w:rPr>
+          <w:b/>
+          <w:bCs/>
+          <w:sz w:val="22"/>
+          <w:szCs w:val="22"/>
+        </w:rPr>
+        <w:tab/>
+      </w:r>
+      <w:r>
+        <w:rPr>
+          <w:sz w:val="22"/>
+          <w:szCs w:val="22"/>
+        </w:rPr>
+        <w:t>Orders, Reviews, Saved Items, Profile Settings</w:t>
+      </w:r>
+    </w:p>
+    <w:p>
+      <w:pPr>
+        <w:pBdr>
+          <w:top w:val="single" w:sz="4" w:space="1" w:color="auto"/>
+          <w:left w:val="single" w:sz="4" w:space="4" w:color="auto"/>
+          <w:bottom w:val="single" w:sz="4" w:space="1" w:color="auto"/>
+          <w:right w:val="single" w:sz="4" w:space="4" w:color="auto"/>
+          <w:between w:val="single" w:sz="4" w:space="1" w:color="auto"/>
+          <w:bar w:val="single" w:sz="4" w:color="auto"/>
+        </w:pBdr>
+        <w:rPr>
+          <w:b/>
+          <w:bCs/>
+          <w:sz w:val="22"/>
+          <w:szCs w:val="22"/>
+        </w:rPr>
+      </w:pPr>
+      <w:r>
+        <w:rPr>
+          <w:b/>
+          <w:bCs/>
+          <w:sz w:val="22"/>
+          <w:szCs w:val="22"/>
+        </w:rPr>
+        <w:t>Customer Services</w:t>
+      </w:r>
+      <w:r>
+        <w:rPr>
+          <w:b/>
+          <w:bCs/>
+          <w:sz w:val="22"/>
+          <w:szCs w:val="22"/>
+        </w:rPr>
+        <w:t>:</w:t>
+      </w:r>
+      <w:r>
+        <w:rPr>
+          <w:b/>
+          <w:bCs/>
+          <w:sz w:val="22"/>
+          <w:szCs w:val="22"/>
+        </w:rPr>
+        <w:tab/>
+      </w:r>
+      <w:r>
+        <w:rPr>
+          <w:sz w:val="22"/>
+          <w:szCs w:val="22"/>
+        </w:rPr>
+        <w:t>Track Order, Return Policy, Support Chat</w:t>
+      </w:r>
+    </w:p>
+    <w:p>
+      <w:pPr>
+        <w:pBdr>
+          <w:top w:val="single" w:sz="4" w:space="1" w:color="auto"/>
+          <w:left w:val="single" w:sz="4" w:space="4" w:color="auto"/>
+          <w:bottom w:val="single" w:sz="4" w:space="1" w:color="auto"/>
+          <w:right w:val="single" w:sz="4" w:space="4" w:color="auto"/>
+          <w:between w:val="single" w:sz="4" w:space="1" w:color="auto"/>
+          <w:bar w:val="single" w:sz="4" w:color="auto"/>
+        </w:pBdr>
+        <w:rPr>
+          <w:b/>
+          <w:bCs/>
+          <w:sz w:val="22"/>
+          <w:szCs w:val="22"/>
+        </w:rPr>
+      </w:pPr>
+      <w:r>
+        <w:rPr>
+          <w:b/>
+          <w:bCs/>
+          <w:sz w:val="22"/>
+          <w:szCs w:val="22"/>
+        </w:rPr>
+        <w:t>Promotions</w:t>
+      </w:r>
+      <w:r>
+        <w:rPr>
+          <w:b/>
+          <w:bCs/>
+          <w:sz w:val="22"/>
+          <w:szCs w:val="22"/>
+        </w:rPr>
+        <w:t>:</w:t>
+      </w:r>
+      <w:r>
+        <w:rPr>
+          <w:b/>
+          <w:bCs/>
+          <w:sz w:val="22"/>
+          <w:szCs w:val="22"/>
+        </w:rPr>
+        <w:tab/>
+      </w:r>
+      <w:r>
+        <w:rPr>
+          <w:b/>
+          <w:bCs/>
+          <w:sz w:val="22"/>
+          <w:szCs w:val="22"/>
+        </w:rPr>
+        <w:tab/>
+      </w:r>
+      <w:r>
+        <w:rPr>
+          <w:sz w:val="22"/>
+          <w:szCs w:val="22"/>
+        </w:rPr>
+        <w:t>Personalized Deals, Loyalty Points, Referral Program</w:t>
+      </w:r>
+    </w:p>
+    <w:p>
+      <w:pPr>
+        <w:pBdr>
+          <w:top w:val="single" w:sz="4" w:space="1" w:color="auto"/>
+          <w:left w:val="single" w:sz="4" w:space="4" w:color="auto"/>
+          <w:bottom w:val="single" w:sz="4" w:space="1" w:color="auto"/>
+          <w:right w:val="single" w:sz="4" w:space="4" w:color="auto"/>
+          <w:between w:val="single" w:sz="4" w:space="1" w:color="auto"/>
+          <w:bar w:val="single" w:sz="4" w:color="auto"/>
+        </w:pBdr>
+        <w:rPr>
+          <w:b/>
+          <w:bCs/>
+          <w:sz w:val="22"/>
+          <w:szCs w:val="22"/>
+        </w:rPr>
+      </w:pPr>
+      <w:r>
+        <w:rPr>
+          <w:b/>
+          <w:bCs/>
+          <w:sz w:val="22"/>
+          <w:szCs w:val="22"/>
+        </w:rPr>
+        <w:t>Help &amp; Support</w:t>
+      </w:r>
+      <w:r>
+        <w:rPr>
+          <w:b/>
+          <w:bCs/>
+          <w:sz w:val="22"/>
+          <w:szCs w:val="22"/>
+        </w:rPr>
+        <w:tab/>
+      </w:r>
+      <w:r>
+        <w:rPr>
+          <w:sz w:val="22"/>
+          <w:szCs w:val="22"/>
+        </w:rPr>
+        <w:t>Contact Us, Help Center, Accessibility, Privacy</w:t>
+      </w:r>
+    </w:p>
+    <w:p>
+      <w:pPr>
+        <w:pBdr>
+          <w:top w:val="single" w:sz="4" w:space="1" w:color="auto"/>
+          <w:left w:val="single" w:sz="4" w:space="4" w:color="auto"/>
+          <w:bottom w:val="single" w:sz="4" w:space="1" w:color="auto"/>
+          <w:right w:val="single" w:sz="4" w:space="4" w:color="auto"/>
+          <w:between w:val="single" w:sz="4" w:space="1" w:color="auto"/>
+          <w:bar w:val="single" w:sz="4" w:color="auto"/>
+        </w:pBdr>
+        <w:rPr>
+          <w:b/>
+          <w:bCs/>
+          <w:sz w:val="22"/>
+          <w:szCs w:val="22"/>
+        </w:rPr>
+      </w:pPr>
+      <w:r>
+        <w:rPr>
+          <w:b/>
+          <w:bCs/>
+          <w:sz w:val="22"/>
+          <w:szCs w:val="22"/>
+        </w:rPr>
+        <w:t>Connect With Us</w:t>
+      </w:r>
+      <w:r>
+        <w:rPr>
+          <w:b/>
+          <w:bCs/>
+          <w:sz w:val="22"/>
+          <w:szCs w:val="22"/>
+        </w:rPr>
+        <w:tab/>
+      </w:r>
+      <w:r>
+        <w:rPr>
+          <w:sz w:val="22"/>
+          <w:szCs w:val="22"/>
+        </w:rPr>
+        <w:t>Twitter, Facebook, Instagram, LinkedIn</w:t>
+      </w:r>
+    </w:p>
+    <w:p>
+      <w:pPr>
+        <w:pStyle w:val="ListParagraph"/>
+        <w:numPr>
+          <w:ilvl w:val="0"/>
+          <w:numId w:val="24"/>
+        </w:numPr>
+        <w:rPr>
+          <w:b/>
+          <w:bCs/>
+          <w:sz w:val="22"/>
+          <w:szCs w:val="22"/>
+        </w:rPr>
+      </w:pPr>
+      <w:r>
+        <w:rPr>
+          <w:b/>
+          <w:bCs/>
+          <w:sz w:val="22"/>
+          <w:szCs w:val="22"/>
+        </w:rPr>
+        <w:lastRenderedPageBreak/>
+        <w:t>Vendor Page Footer Wireframe</w:t>
+      </w:r>
+    </w:p>
+    <w:p>
+      <w:pPr>
+        <w:pBdr>
+          <w:top w:val="single" w:sz="4" w:space="1" w:color="auto"/>
+          <w:left w:val="single" w:sz="4" w:space="4" w:color="auto"/>
+          <w:bottom w:val="single" w:sz="4" w:space="1" w:color="auto"/>
+          <w:right w:val="single" w:sz="4" w:space="4" w:color="auto"/>
+          <w:between w:val="single" w:sz="4" w:space="1" w:color="auto"/>
+          <w:bar w:val="single" w:sz="4" w:color="auto"/>
+        </w:pBdr>
+        <w:shd w:val="clear" w:color="auto" w:fill="00B0F0"/>
+        <w:rPr>
+          <w:b/>
+          <w:bCs/>
+          <w:sz w:val="22"/>
+          <w:szCs w:val="22"/>
+        </w:rPr>
+      </w:pPr>
+      <w:r>
+        <w:rPr>
+          <w:b/>
+          <w:bCs/>
+          <w:sz w:val="22"/>
+          <w:szCs w:val="22"/>
+        </w:rPr>
+        <w:t>Section</w:t>
+      </w:r>
+      <w:r>
+        <w:rPr>
+          <w:b/>
+          <w:bCs/>
+          <w:sz w:val="22"/>
+          <w:szCs w:val="22"/>
+        </w:rPr>
+        <w:tab/>
+      </w:r>
+      <w:r>
+        <w:rPr>
+          <w:b/>
+          <w:bCs/>
+          <w:sz w:val="22"/>
+          <w:szCs w:val="22"/>
+        </w:rPr>
+        <w:tab/>
+      </w:r>
+      <w:r>
+        <w:rPr>
+          <w:b/>
+          <w:bCs/>
+          <w:sz w:val="22"/>
+          <w:szCs w:val="22"/>
+        </w:rPr>
+        <w:t>Links</w:t>
+      </w:r>
+    </w:p>
+    <w:p>
+      <w:pPr>
+        <w:pBdr>
+          <w:top w:val="single" w:sz="4" w:space="1" w:color="auto"/>
+          <w:left w:val="single" w:sz="4" w:space="4" w:color="auto"/>
+          <w:bottom w:val="single" w:sz="4" w:space="1" w:color="auto"/>
+          <w:right w:val="single" w:sz="4" w:space="4" w:color="auto"/>
+          <w:between w:val="single" w:sz="4" w:space="1" w:color="auto"/>
+          <w:bar w:val="single" w:sz="4" w:color="auto"/>
+        </w:pBdr>
+        <w:rPr>
+          <w:b/>
+          <w:bCs/>
+          <w:sz w:val="22"/>
+          <w:szCs w:val="22"/>
+        </w:rPr>
+      </w:pPr>
+      <w:r>
+        <w:rPr>
+          <w:b/>
+          <w:bCs/>
+          <w:sz w:val="22"/>
+          <w:szCs w:val="22"/>
+        </w:rPr>
+        <w:t>Explore Merkato</w:t>
+      </w:r>
+      <w:r>
+        <w:rPr>
+          <w:b/>
+          <w:bCs/>
+          <w:sz w:val="22"/>
+          <w:szCs w:val="22"/>
+        </w:rPr>
+        <w:t>:</w:t>
+      </w:r>
+      <w:r>
+        <w:rPr>
+          <w:b/>
+          <w:bCs/>
+          <w:sz w:val="22"/>
+          <w:szCs w:val="22"/>
+        </w:rPr>
+        <w:tab/>
+        <w:t>About Us, Careers, Blog, Press, Telium Ecosystem</w:t>
+      </w:r>
+    </w:p>
+    <w:p>
+      <w:pPr>
+        <w:pBdr>
+          <w:top w:val="single" w:sz="4" w:space="1" w:color="auto"/>
+          <w:left w:val="single" w:sz="4" w:space="4" w:color="auto"/>
+          <w:bottom w:val="single" w:sz="4" w:space="1" w:color="auto"/>
+          <w:right w:val="single" w:sz="4" w:space="4" w:color="auto"/>
+          <w:between w:val="single" w:sz="4" w:space="1" w:color="auto"/>
+          <w:bar w:val="single" w:sz="4" w:color="auto"/>
+        </w:pBdr>
+        <w:rPr>
+          <w:b/>
+          <w:bCs/>
+          <w:sz w:val="22"/>
+          <w:szCs w:val="22"/>
+        </w:rPr>
+      </w:pPr>
+      <w:r>
+        <w:rPr>
+          <w:b/>
+          <w:bCs/>
+          <w:sz w:val="22"/>
+          <w:szCs w:val="22"/>
+        </w:rPr>
+        <w:t>Vendor Tools</w:t>
+      </w:r>
+      <w:r>
+        <w:rPr>
+          <w:b/>
+          <w:bCs/>
+          <w:sz w:val="22"/>
+          <w:szCs w:val="22"/>
+        </w:rPr>
+        <w:t xml:space="preserve">: </w:t>
+      </w:r>
+      <w:r>
+        <w:rPr>
+          <w:b/>
+          <w:bCs/>
+          <w:sz w:val="22"/>
+          <w:szCs w:val="22"/>
+        </w:rPr>
+        <w:tab/>
+      </w:r>
+      <w:r>
+        <w:rPr>
+          <w:b/>
+          <w:bCs/>
+          <w:sz w:val="22"/>
+          <w:szCs w:val="22"/>
+        </w:rPr>
+        <w:tab/>
+        <w:t>Upload</w:t>
+      </w:r>
+      <w:r>
+        <w:rPr>
+          <w:b/>
+          <w:bCs/>
+          <w:sz w:val="22"/>
+          <w:szCs w:val="22"/>
+        </w:rPr>
+        <w:t xml:space="preserve"> Product, Manage Inventory, View Orders, Analytics Dashboard</w:t>
+      </w:r>
+    </w:p>
+    <w:p>
+      <w:pPr>
+        <w:pBdr>
+          <w:top w:val="single" w:sz="4" w:space="1" w:color="auto"/>
+          <w:left w:val="single" w:sz="4" w:space="4" w:color="auto"/>
+          <w:bottom w:val="single" w:sz="4" w:space="1" w:color="auto"/>
+          <w:right w:val="single" w:sz="4" w:space="4" w:color="auto"/>
+          <w:between w:val="single" w:sz="4" w:space="1" w:color="auto"/>
+          <w:bar w:val="single" w:sz="4" w:color="auto"/>
+        </w:pBdr>
+        <w:rPr>
+          <w:b/>
+          <w:bCs/>
+          <w:sz w:val="22"/>
+          <w:szCs w:val="22"/>
+        </w:rPr>
+      </w:pPr>
+      <w:r>
+        <w:rPr>
+          <w:b/>
+          <w:bCs/>
+          <w:sz w:val="22"/>
+          <w:szCs w:val="22"/>
+        </w:rPr>
+        <w:t>Resources</w:t>
+      </w:r>
+      <w:r>
+        <w:rPr>
+          <w:b/>
+          <w:bCs/>
+          <w:sz w:val="22"/>
+          <w:szCs w:val="22"/>
+        </w:rPr>
+        <w:t>:</w:t>
+      </w:r>
+      <w:r>
+        <w:rPr>
+          <w:b/>
+          <w:bCs/>
+          <w:sz w:val="22"/>
+          <w:szCs w:val="22"/>
+        </w:rPr>
+        <w:tab/>
+      </w:r>
+      <w:r>
+        <w:rPr>
+          <w:b/>
+          <w:bCs/>
+          <w:sz w:val="22"/>
+          <w:szCs w:val="22"/>
+        </w:rPr>
+        <w:tab/>
+      </w:r>
+      <w:r>
+        <w:rPr>
+          <w:b/>
+          <w:bCs/>
+          <w:sz w:val="22"/>
+          <w:szCs w:val="22"/>
+        </w:rPr>
+        <w:t>Seller Help Center, Pricing Guide, API Docs</w:t>
+      </w:r>
+    </w:p>
+    <w:p>
+      <w:pPr>
+        <w:pBdr>
+          <w:top w:val="single" w:sz="4" w:space="1" w:color="auto"/>
+          <w:left w:val="single" w:sz="4" w:space="4" w:color="auto"/>
+          <w:bottom w:val="single" w:sz="4" w:space="1" w:color="auto"/>
+          <w:right w:val="single" w:sz="4" w:space="4" w:color="auto"/>
+          <w:between w:val="single" w:sz="4" w:space="1" w:color="auto"/>
+          <w:bar w:val="single" w:sz="4" w:color="auto"/>
+        </w:pBdr>
+        <w:rPr>
+          <w:b/>
+          <w:bCs/>
+          <w:sz w:val="22"/>
+          <w:szCs w:val="22"/>
+        </w:rPr>
+      </w:pPr>
+      <w:r>
+        <w:rPr>
+          <w:b/>
+          <w:bCs/>
+          <w:sz w:val="22"/>
+          <w:szCs w:val="22"/>
+        </w:rPr>
+        <w:t>Community</w:t>
+      </w:r>
+      <w:r>
+        <w:rPr>
+          <w:b/>
+          <w:bCs/>
+          <w:sz w:val="22"/>
+          <w:szCs w:val="22"/>
+        </w:rPr>
+        <w:t xml:space="preserve">: </w:t>
+      </w:r>
+      <w:r>
+        <w:rPr>
+          <w:b/>
+          <w:bCs/>
+          <w:sz w:val="22"/>
+          <w:szCs w:val="22"/>
+        </w:rPr>
+        <w:tab/>
+      </w:r>
+      <w:r>
+        <w:rPr>
+          <w:b/>
+          <w:bCs/>
+          <w:sz w:val="22"/>
+          <w:szCs w:val="22"/>
+        </w:rPr>
+        <w:tab/>
+        <w:t>Vendor</w:t>
+      </w:r>
+      <w:r>
+        <w:rPr>
+          <w:b/>
+          <w:bCs/>
+          <w:sz w:val="22"/>
+          <w:szCs w:val="22"/>
+        </w:rPr>
+        <w:t xml:space="preserve"> Forum, Webinars, </w:t>
+      </w:r>
+    </w:p>
+    <w:p>
+      <w:pPr>
+        <w:pBdr>
+          <w:top w:val="single" w:sz="4" w:space="1" w:color="auto"/>
+          <w:left w:val="single" w:sz="4" w:space="4" w:color="auto"/>
+          <w:bottom w:val="single" w:sz="4" w:space="1" w:color="auto"/>
+          <w:right w:val="single" w:sz="4" w:space="4" w:color="auto"/>
+          <w:between w:val="single" w:sz="4" w:space="1" w:color="auto"/>
+          <w:bar w:val="single" w:sz="4" w:color="auto"/>
+        </w:pBdr>
+        <w:rPr>
+          <w:b/>
+          <w:bCs/>
+          <w:sz w:val="22"/>
+          <w:szCs w:val="22"/>
+        </w:rPr>
+      </w:pPr>
+      <w:r>
+        <w:rPr>
+          <w:b/>
+          <w:bCs/>
+          <w:sz w:val="22"/>
+          <w:szCs w:val="22"/>
+        </w:rPr>
+        <w:t>Help &amp; Support</w:t>
+      </w:r>
+      <w:r>
+        <w:rPr>
+          <w:b/>
+          <w:bCs/>
+          <w:sz w:val="22"/>
+          <w:szCs w:val="22"/>
+        </w:rPr>
+        <w:t>:</w:t>
+      </w:r>
+      <w:r>
+        <w:rPr>
+          <w:b/>
+          <w:bCs/>
+          <w:sz w:val="22"/>
+          <w:szCs w:val="22"/>
+        </w:rPr>
+        <w:tab/>
+        <w:t>Contact Us, Help Center, Accessibility, Privacy</w:t>
+      </w:r>
+    </w:p>
+    <w:p>
+      <w:pPr>
+        <w:pBdr>
+          <w:top w:val="single" w:sz="4" w:space="1" w:color="auto"/>
+          <w:left w:val="single" w:sz="4" w:space="4" w:color="auto"/>
+          <w:bottom w:val="single" w:sz="4" w:space="1" w:color="auto"/>
+          <w:right w:val="single" w:sz="4" w:space="4" w:color="auto"/>
+          <w:between w:val="single" w:sz="4" w:space="1" w:color="auto"/>
+          <w:bar w:val="single" w:sz="4" w:color="auto"/>
+        </w:pBdr>
+        <w:rPr>
+          <w:b/>
+          <w:bCs/>
+          <w:sz w:val="22"/>
+          <w:szCs w:val="22"/>
+        </w:rPr>
+      </w:pPr>
+      <w:r>
+        <w:rPr>
+          <w:b/>
+          <w:bCs/>
+          <w:sz w:val="22"/>
+          <w:szCs w:val="22"/>
+        </w:rPr>
+        <w:t>Connect With Us</w:t>
+      </w:r>
+      <w:r>
+        <w:rPr>
+          <w:b/>
+          <w:bCs/>
+          <w:sz w:val="22"/>
+          <w:szCs w:val="22"/>
+        </w:rPr>
+        <w:t>:</w:t>
+      </w:r>
+      <w:r>
+        <w:rPr>
+          <w:b/>
+          <w:bCs/>
+          <w:sz w:val="22"/>
+          <w:szCs w:val="22"/>
+        </w:rPr>
+        <w:tab/>
+        <w:t>Twitter, Facebook, Instagram, LinkedIn</w:t>
+      </w:r>
+    </w:p>
+    <w:p>
+      <w:pPr>
+        <w:rPr>
+          <w:b/>
+          <w:bCs/>
+          <w:sz w:val="22"/>
+          <w:szCs w:val="22"/>
+        </w:rPr>
+      </w:pPr>
+    </w:p>
+    <w:p>
+      <w:pPr>
+        <w:pStyle w:val="ListParagraph"/>
+        <w:numPr>
+          <w:ilvl w:val="0"/>
+          <w:numId w:val="24"/>
+        </w:numPr>
+        <w:rPr>
+          <w:b/>
+          <w:bCs/>
+          <w:sz w:val="22"/>
+          <w:szCs w:val="22"/>
+        </w:rPr>
+      </w:pPr>
+      <w:r>
+        <w:rPr>
+          <w:b/>
+          <w:bCs/>
+          <w:sz w:val="22"/>
+          <w:szCs w:val="22"/>
+        </w:rPr>
+        <w:t>Admin Page Footer Wireframe (or Sidebar Alternative)</w:t>
+      </w:r>
+    </w:p>
+    <w:p>
+      <w:pPr>
+        <w:pBdr>
+          <w:top w:val="single" w:sz="4" w:space="1" w:color="auto"/>
+          <w:left w:val="single" w:sz="4" w:space="4" w:color="auto"/>
+          <w:bottom w:val="single" w:sz="4" w:space="1" w:color="auto"/>
+          <w:right w:val="single" w:sz="4" w:space="4" w:color="auto"/>
+          <w:between w:val="single" w:sz="4" w:space="1" w:color="auto"/>
+          <w:bar w:val="single" w:sz="4" w:color="auto"/>
+        </w:pBdr>
+        <w:shd w:val="clear" w:color="auto" w:fill="00B0F0"/>
+        <w:rPr>
+          <w:b/>
+          <w:bCs/>
+          <w:sz w:val="22"/>
+          <w:szCs w:val="22"/>
+        </w:rPr>
+      </w:pPr>
+      <w:r>
+        <w:rPr>
+          <w:b/>
+          <w:bCs/>
+          <w:sz w:val="22"/>
+          <w:szCs w:val="22"/>
+        </w:rPr>
+        <w:t>Section</w:t>
+      </w:r>
+      <w:r>
+        <w:rPr>
+          <w:b/>
+          <w:bCs/>
+          <w:sz w:val="22"/>
+          <w:szCs w:val="22"/>
+        </w:rPr>
+        <w:tab/>
+      </w:r>
+      <w:r>
+        <w:rPr>
+          <w:b/>
+          <w:bCs/>
+          <w:sz w:val="22"/>
+          <w:szCs w:val="22"/>
+        </w:rPr>
+        <w:tab/>
+      </w:r>
+      <w:r>
+        <w:rPr>
+          <w:b/>
+          <w:bCs/>
+          <w:sz w:val="22"/>
+          <w:szCs w:val="22"/>
+        </w:rPr>
+        <w:tab/>
+      </w:r>
+      <w:r>
+        <w:rPr>
+          <w:b/>
+          <w:bCs/>
+          <w:sz w:val="22"/>
+          <w:szCs w:val="22"/>
+        </w:rPr>
+        <w:t>Links</w:t>
+      </w:r>
+    </w:p>
+    <w:p>
+      <w:pPr>
+        <w:pBdr>
+          <w:top w:val="single" w:sz="4" w:space="1" w:color="auto"/>
+          <w:left w:val="single" w:sz="4" w:space="4" w:color="auto"/>
+          <w:bottom w:val="single" w:sz="4" w:space="1" w:color="auto"/>
+          <w:right w:val="single" w:sz="4" w:space="4" w:color="auto"/>
+          <w:between w:val="single" w:sz="4" w:space="1" w:color="auto"/>
+          <w:bar w:val="single" w:sz="4" w:color="auto"/>
+        </w:pBdr>
+        <w:rPr>
+          <w:b/>
+          <w:bCs/>
+          <w:sz w:val="22"/>
+          <w:szCs w:val="22"/>
+        </w:rPr>
+      </w:pPr>
+      <w:r>
+        <w:rPr>
+          <w:b/>
+          <w:bCs/>
+          <w:sz w:val="22"/>
+          <w:szCs w:val="22"/>
+        </w:rPr>
+        <w:t>System Tools</w:t>
+      </w:r>
+      <w:r>
+        <w:rPr>
+          <w:b/>
+          <w:bCs/>
+          <w:sz w:val="22"/>
+          <w:szCs w:val="22"/>
+        </w:rPr>
+        <w:t xml:space="preserve">: </w:t>
+      </w:r>
+      <w:r>
+        <w:rPr>
+          <w:b/>
+          <w:bCs/>
+          <w:sz w:val="22"/>
+          <w:szCs w:val="22"/>
+        </w:rPr>
+        <w:tab/>
+      </w:r>
+      <w:r>
+        <w:rPr>
+          <w:b/>
+          <w:bCs/>
+          <w:sz w:val="22"/>
+          <w:szCs w:val="22"/>
+        </w:rPr>
+        <w:tab/>
+      </w:r>
+      <w:r>
+        <w:rPr>
+          <w:sz w:val="22"/>
+          <w:szCs w:val="22"/>
+        </w:rPr>
+        <w:t>User</w:t>
+      </w:r>
+      <w:r>
+        <w:rPr>
+          <w:sz w:val="22"/>
+          <w:szCs w:val="22"/>
+        </w:rPr>
+        <w:t xml:space="preserve"> Management, Moderation Queue, Logs, Campaign Manager</w:t>
+      </w:r>
+    </w:p>
+    <w:p>
+      <w:pPr>
+        <w:pBdr>
+          <w:top w:val="single" w:sz="4" w:space="1" w:color="auto"/>
+          <w:left w:val="single" w:sz="4" w:space="4" w:color="auto"/>
+          <w:bottom w:val="single" w:sz="4" w:space="1" w:color="auto"/>
+          <w:right w:val="single" w:sz="4" w:space="4" w:color="auto"/>
+          <w:between w:val="single" w:sz="4" w:space="1" w:color="auto"/>
+          <w:bar w:val="single" w:sz="4" w:color="auto"/>
+        </w:pBdr>
+        <w:rPr>
+          <w:b/>
+          <w:bCs/>
+          <w:sz w:val="22"/>
+          <w:szCs w:val="22"/>
+        </w:rPr>
+      </w:pPr>
+      <w:r>
+        <w:rPr>
+          <w:b/>
+          <w:bCs/>
+          <w:sz w:val="22"/>
+          <w:szCs w:val="22"/>
+        </w:rPr>
+        <w:t>Governance</w:t>
+      </w:r>
+      <w:r>
+        <w:rPr>
+          <w:b/>
+          <w:bCs/>
+          <w:sz w:val="22"/>
+          <w:szCs w:val="22"/>
+        </w:rPr>
+        <w:t xml:space="preserve">: </w:t>
+      </w:r>
+      <w:r>
+        <w:rPr>
+          <w:b/>
+          <w:bCs/>
+          <w:sz w:val="22"/>
+          <w:szCs w:val="22"/>
+        </w:rPr>
+        <w:tab/>
+      </w:r>
+      <w:r>
+        <w:rPr>
+          <w:b/>
+          <w:bCs/>
+          <w:sz w:val="22"/>
+          <w:szCs w:val="22"/>
+        </w:rPr>
+        <w:tab/>
+      </w:r>
+      <w:r>
+        <w:rPr>
+          <w:sz w:val="22"/>
+          <w:szCs w:val="22"/>
+        </w:rPr>
+        <w:t>Audit</w:t>
+      </w:r>
+      <w:r>
+        <w:rPr>
+          <w:sz w:val="22"/>
+          <w:szCs w:val="22"/>
+        </w:rPr>
+        <w:t xml:space="preserve"> Trails, Role Permissions, Feature Flags</w:t>
+      </w:r>
+    </w:p>
+    <w:p>
+      <w:pPr>
+        <w:pBdr>
+          <w:top w:val="single" w:sz="4" w:space="1" w:color="auto"/>
+          <w:left w:val="single" w:sz="4" w:space="4" w:color="auto"/>
+          <w:bottom w:val="single" w:sz="4" w:space="1" w:color="auto"/>
+          <w:right w:val="single" w:sz="4" w:space="4" w:color="auto"/>
+          <w:between w:val="single" w:sz="4" w:space="1" w:color="auto"/>
+          <w:bar w:val="single" w:sz="4" w:color="auto"/>
+        </w:pBdr>
+        <w:rPr>
+          <w:b/>
+          <w:bCs/>
+          <w:sz w:val="22"/>
+          <w:szCs w:val="22"/>
+        </w:rPr>
+      </w:pPr>
+      <w:r>
+        <w:rPr>
+          <w:b/>
+          <w:bCs/>
+          <w:sz w:val="22"/>
+          <w:szCs w:val="22"/>
+        </w:rPr>
+        <w:t>Documentation</w:t>
+      </w:r>
+      <w:r>
+        <w:rPr>
+          <w:b/>
+          <w:bCs/>
+          <w:sz w:val="22"/>
+          <w:szCs w:val="22"/>
+        </w:rPr>
+        <w:t>:</w:t>
+      </w:r>
+      <w:r>
+        <w:rPr>
+          <w:b/>
+          <w:bCs/>
+          <w:sz w:val="22"/>
+          <w:szCs w:val="22"/>
+        </w:rPr>
+        <w:tab/>
+      </w:r>
+      <w:r>
+        <w:rPr>
+          <w:sz w:val="22"/>
+          <w:szCs w:val="22"/>
+        </w:rPr>
+        <w:t>Internal Wiki, DevOps Playbook, Release Notes</w:t>
+      </w:r>
+    </w:p>
+    <w:p>
+      <w:pPr>
+        <w:pBdr>
+          <w:top w:val="single" w:sz="4" w:space="1" w:color="auto"/>
+          <w:left w:val="single" w:sz="4" w:space="4" w:color="auto"/>
+          <w:bottom w:val="single" w:sz="4" w:space="1" w:color="auto"/>
+          <w:right w:val="single" w:sz="4" w:space="4" w:color="auto"/>
+          <w:between w:val="single" w:sz="4" w:space="1" w:color="auto"/>
+          <w:bar w:val="single" w:sz="4" w:color="auto"/>
+        </w:pBdr>
+        <w:rPr>
+          <w:sz w:val="22"/>
+          <w:szCs w:val="22"/>
+        </w:rPr>
+      </w:pPr>
+      <w:r>
+        <w:rPr>
+          <w:b/>
+          <w:bCs/>
+          <w:sz w:val="22"/>
+          <w:szCs w:val="22"/>
+        </w:rPr>
+        <w:t>Help &amp; Support</w:t>
+      </w:r>
+      <w:r>
+        <w:rPr>
+          <w:b/>
+          <w:bCs/>
+          <w:sz w:val="22"/>
+          <w:szCs w:val="22"/>
+        </w:rPr>
+        <w:t>:</w:t>
+      </w:r>
+      <w:r>
+        <w:rPr>
+          <w:b/>
+          <w:bCs/>
+          <w:sz w:val="22"/>
+          <w:szCs w:val="22"/>
+        </w:rPr>
+        <w:tab/>
+      </w:r>
+      <w:r>
+        <w:rPr>
+          <w:sz w:val="22"/>
+          <w:szCs w:val="22"/>
+        </w:rPr>
+        <w:t>Contact Dev Team, Internal Help Center</w:t>
+      </w:r>
     </w:p>
     <w:p>
       <w:pPr>
@@ -6803,6 +9405,155 @@
     </w:lvl>
   </w:abstractNum>
   <w:abstractNum w:abstractNumId="6" w15:restartNumberingAfterBreak="0">
+    <w:nsid w:val="0CF67199"/>
+    <w:multiLevelType w:val="multilevel"/>
+    <w:tmpl w:val="9D903B7C"/>
+    <w:lvl w:ilvl="0">
+      <w:start w:val="1"/>
+      <w:numFmt w:val="bullet"/>
+      <w:lvlText w:val=""/>
+      <w:lvlJc w:val="left"/>
+      <w:pPr>
+        <w:tabs>
+          <w:tab w:val="num" w:pos="720"/>
+        </w:tabs>
+        <w:ind w:left="720" w:hanging="360"/>
+      </w:pPr>
+      <w:rPr>
+        <w:rFonts w:ascii="Symbol" w:hAnsi="Symbol" w:hint="default"/>
+        <w:sz w:val="20"/>
+      </w:rPr>
+    </w:lvl>
+    <w:lvl w:ilvl="1" w:tentative="1">
+      <w:start w:val="1"/>
+      <w:numFmt w:val="bullet"/>
+      <w:lvlText w:val="o"/>
+      <w:lvlJc w:val="left"/>
+      <w:pPr>
+        <w:tabs>
+          <w:tab w:val="num" w:pos="1440"/>
+        </w:tabs>
+        <w:ind w:left="1440" w:hanging="360"/>
+      </w:pPr>
+      <w:rPr>
+        <w:rFonts w:ascii="Courier New" w:hAnsi="Courier New" w:hint="default"/>
+        <w:sz w:val="20"/>
+      </w:rPr>
+    </w:lvl>
+    <w:lvl w:ilvl="2" w:tentative="1">
+      <w:start w:val="1"/>
+      <w:numFmt w:val="bullet"/>
+      <w:lvlText w:val=""/>
+      <w:lvlJc w:val="left"/>
+      <w:pPr>
+        <w:tabs>
+          <w:tab w:val="num" w:pos="2160"/>
+        </w:tabs>
+        <w:ind w:left="2160" w:hanging="360"/>
+      </w:pPr>
+      <w:rPr>
+        <w:rFonts w:ascii="Wingdings" w:hAnsi="Wingdings" w:hint="default"/>
+        <w:sz w:val="20"/>
+      </w:rPr>
+    </w:lvl>
+    <w:lvl w:ilvl="3" w:tentative="1">
+      <w:start w:val="1"/>
+      <w:numFmt w:val="bullet"/>
+      <w:lvlText w:val=""/>
+      <w:lvlJc w:val="left"/>
+      <w:pPr>
+        <w:tabs>
+          <w:tab w:val="num" w:pos="2880"/>
+        </w:tabs>
+        <w:ind w:left="2880" w:hanging="360"/>
+      </w:pPr>
+      <w:rPr>
+        <w:rFonts w:ascii="Wingdings" w:hAnsi="Wingdings" w:hint="default"/>
+        <w:sz w:val="20"/>
+      </w:rPr>
+    </w:lvl>
+    <w:lvl w:ilvl="4" w:tentative="1">
+      <w:start w:val="1"/>
+      <w:numFmt w:val="bullet"/>
+      <w:lvlText w:val=""/>
+      <w:lvlJc w:val="left"/>
+      <w:pPr>
+        <w:tabs>
+          <w:tab w:val="num" w:pos="3600"/>
+        </w:tabs>
+        <w:ind w:left="3600" w:hanging="360"/>
+      </w:pPr>
+      <w:rPr>
+        <w:rFonts w:ascii="Wingdings" w:hAnsi="Wingdings" w:hint="default"/>
+        <w:sz w:val="20"/>
+      </w:rPr>
+    </w:lvl>
+    <w:lvl w:ilvl="5" w:tentative="1">
+      <w:start w:val="1"/>
+      <w:numFmt w:val="bullet"/>
+      <w:lvlText w:val=""/>
+      <w:lvlJc w:val="left"/>
+      <w:pPr>
+        <w:tabs>
+          <w:tab w:val="num" w:pos="4320"/>
+        </w:tabs>
+        <w:ind w:left="4320" w:hanging="360"/>
+      </w:pPr>
+      <w:rPr>
+        <w:rFonts w:ascii="Wingdings" w:hAnsi="Wingdings" w:hint="default"/>
+        <w:sz w:val="20"/>
+      </w:rPr>
+    </w:lvl>
+    <w:lvl w:ilvl="6" w:tentative="1">
+      <w:start w:val="1"/>
+      <w:numFmt w:val="bullet"/>
+      <w:lvlText w:val=""/>
+      <w:lvlJc w:val="left"/>
+      <w:pPr>
+        <w:tabs>
+          <w:tab w:val="num" w:pos="5040"/>
+        </w:tabs>
+        <w:ind w:left="5040" w:hanging="360"/>
+      </w:pPr>
+      <w:rPr>
+        <w:rFonts w:ascii="Wingdings" w:hAnsi="Wingdings" w:hint="default"/>
+        <w:sz w:val="20"/>
+      </w:rPr>
+    </w:lvl>
+    <w:lvl w:ilvl="7" w:tentative="1">
+      <w:start w:val="1"/>
+      <w:numFmt w:val="bullet"/>
+      <w:lvlText w:val=""/>
+      <w:lvlJc w:val="left"/>
+      <w:pPr>
+        <w:tabs>
+          <w:tab w:val="num" w:pos="5760"/>
+        </w:tabs>
+        <w:ind w:left="5760" w:hanging="360"/>
+      </w:pPr>
+      <w:rPr>
+        <w:rFonts w:ascii="Wingdings" w:hAnsi="Wingdings" w:hint="default"/>
+        <w:sz w:val="20"/>
+      </w:rPr>
+    </w:lvl>
+    <w:lvl w:ilvl="8" w:tentative="1">
+      <w:start w:val="1"/>
+      <w:numFmt w:val="bullet"/>
+      <w:lvlText w:val=""/>
+      <w:lvlJc w:val="left"/>
+      <w:pPr>
+        <w:tabs>
+          <w:tab w:val="num" w:pos="6480"/>
+        </w:tabs>
+        <w:ind w:left="6480" w:hanging="360"/>
+      </w:pPr>
+      <w:rPr>
+        <w:rFonts w:ascii="Wingdings" w:hAnsi="Wingdings" w:hint="default"/>
+        <w:sz w:val="20"/>
+      </w:rPr>
+    </w:lvl>
+  </w:abstractNum>
+  <w:abstractNum w:abstractNumId="7" w15:restartNumberingAfterBreak="0">
     <w:nsid w:val="0E674949"/>
     <w:multiLevelType w:val="multilevel"/>
     <w:tmpl w:val="654223B8"/>
@@ -6951,7 +9702,120 @@
       </w:rPr>
     </w:lvl>
   </w:abstractNum>
-  <w:abstractNum w:abstractNumId="7" w15:restartNumberingAfterBreak="0">
+  <w:abstractNum w:abstractNumId="8" w15:restartNumberingAfterBreak="0">
+    <w:nsid w:val="10C63699"/>
+    <w:multiLevelType w:val="hybridMultilevel"/>
+    <w:tmpl w:val="B538C092"/>
+    <w:lvl w:ilvl="0" w:tplc="04090001">
+      <w:start w:val="1"/>
+      <w:numFmt w:val="bullet"/>
+      <w:lvlText w:val=""/>
+      <w:lvlJc w:val="left"/>
+      <w:pPr>
+        <w:ind w:left="720" w:hanging="360"/>
+      </w:pPr>
+      <w:rPr>
+        <w:rFonts w:ascii="Symbol" w:hAnsi="Symbol" w:hint="default"/>
+      </w:rPr>
+    </w:lvl>
+    <w:lvl w:ilvl="1" w:tplc="04090003" w:tentative="1">
+      <w:start w:val="1"/>
+      <w:numFmt w:val="bullet"/>
+      <w:lvlText w:val="o"/>
+      <w:lvlJc w:val="left"/>
+      <w:pPr>
+        <w:ind w:left="1440" w:hanging="360"/>
+      </w:pPr>
+      <w:rPr>
+        <w:rFonts w:ascii="Courier New" w:hAnsi="Courier New" w:cs="Courier New" w:hint="default"/>
+      </w:rPr>
+    </w:lvl>
+    <w:lvl w:ilvl="2" w:tplc="04090005" w:tentative="1">
+      <w:start w:val="1"/>
+      <w:numFmt w:val="bullet"/>
+      <w:lvlText w:val=""/>
+      <w:lvlJc w:val="left"/>
+      <w:pPr>
+        <w:ind w:left="2160" w:hanging="360"/>
+      </w:pPr>
+      <w:rPr>
+        <w:rFonts w:ascii="Wingdings" w:hAnsi="Wingdings" w:hint="default"/>
+      </w:rPr>
+    </w:lvl>
+    <w:lvl w:ilvl="3" w:tplc="04090001" w:tentative="1">
+      <w:start w:val="1"/>
+      <w:numFmt w:val="bullet"/>
+      <w:lvlText w:val=""/>
+      <w:lvlJc w:val="left"/>
+      <w:pPr>
+        <w:ind w:left="2880" w:hanging="360"/>
+      </w:pPr>
+      <w:rPr>
+        <w:rFonts w:ascii="Symbol" w:hAnsi="Symbol" w:hint="default"/>
+      </w:rPr>
+    </w:lvl>
+    <w:lvl w:ilvl="4" w:tplc="04090003" w:tentative="1">
+      <w:start w:val="1"/>
+      <w:numFmt w:val="bullet"/>
+      <w:lvlText w:val="o"/>
+      <w:lvlJc w:val="left"/>
+      <w:pPr>
+        <w:ind w:left="3600" w:hanging="360"/>
+      </w:pPr>
+      <w:rPr>
+        <w:rFonts w:ascii="Courier New" w:hAnsi="Courier New" w:cs="Courier New" w:hint="default"/>
+      </w:rPr>
+    </w:lvl>
+    <w:lvl w:ilvl="5" w:tplc="04090005" w:tentative="1">
+      <w:start w:val="1"/>
+      <w:numFmt w:val="bullet"/>
+      <w:lvlText w:val=""/>
+      <w:lvlJc w:val="left"/>
+      <w:pPr>
+        <w:ind w:left="4320" w:hanging="360"/>
+      </w:pPr>
+      <w:rPr>
+        <w:rFonts w:ascii="Wingdings" w:hAnsi="Wingdings" w:hint="default"/>
+      </w:rPr>
+    </w:lvl>
+    <w:lvl w:ilvl="6" w:tplc="04090001" w:tentative="1">
+      <w:start w:val="1"/>
+      <w:numFmt w:val="bullet"/>
+      <w:lvlText w:val=""/>
+      <w:lvlJc w:val="left"/>
+      <w:pPr>
+        <w:ind w:left="5040" w:hanging="360"/>
+      </w:pPr>
+      <w:rPr>
+        <w:rFonts w:ascii="Symbol" w:hAnsi="Symbol" w:hint="default"/>
+      </w:rPr>
+    </w:lvl>
+    <w:lvl w:ilvl="7" w:tplc="04090003" w:tentative="1">
+      <w:start w:val="1"/>
+      <w:numFmt w:val="bullet"/>
+      <w:lvlText w:val="o"/>
+      <w:lvlJc w:val="left"/>
+      <w:pPr>
+        <w:ind w:left="5760" w:hanging="360"/>
+      </w:pPr>
+      <w:rPr>
+        <w:rFonts w:ascii="Courier New" w:hAnsi="Courier New" w:cs="Courier New" w:hint="default"/>
+      </w:rPr>
+    </w:lvl>
+    <w:lvl w:ilvl="8" w:tplc="04090005" w:tentative="1">
+      <w:start w:val="1"/>
+      <w:numFmt w:val="bullet"/>
+      <w:lvlText w:val=""/>
+      <w:lvlJc w:val="left"/>
+      <w:pPr>
+        <w:ind w:left="6480" w:hanging="360"/>
+      </w:pPr>
+      <w:rPr>
+        <w:rFonts w:ascii="Wingdings" w:hAnsi="Wingdings" w:hint="default"/>
+      </w:rPr>
+    </w:lvl>
+  </w:abstractNum>
+  <w:abstractNum w:abstractNumId="9" w15:restartNumberingAfterBreak="0">
     <w:nsid w:val="1205076F"/>
     <w:multiLevelType w:val="multilevel"/>
     <w:tmpl w:val="BB703648"/>
@@ -7100,7 +9964,7 @@
       </w:rPr>
     </w:lvl>
   </w:abstractNum>
-  <w:abstractNum w:abstractNumId="8" w15:restartNumberingAfterBreak="0">
+  <w:abstractNum w:abstractNumId="10" w15:restartNumberingAfterBreak="0">
     <w:nsid w:val="14BB75EC"/>
     <w:multiLevelType w:val="multilevel"/>
     <w:tmpl w:val="600CFFC0"/>
@@ -7249,7 +10113,322 @@
       </w:rPr>
     </w:lvl>
   </w:abstractNum>
-  <w:abstractNum w:abstractNumId="9" w15:restartNumberingAfterBreak="0">
+  <w:abstractNum w:abstractNumId="11" w15:restartNumberingAfterBreak="0">
+    <w:nsid w:val="16A57242"/>
+    <w:multiLevelType w:val="hybridMultilevel"/>
+    <w:tmpl w:val="206044D8"/>
+    <w:lvl w:ilvl="0" w:tplc="0409000F">
+      <w:start w:val="1"/>
+      <w:numFmt w:val="decimal"/>
+      <w:lvlText w:val="%1."/>
+      <w:lvlJc w:val="left"/>
+      <w:pPr>
+        <w:ind w:left="720" w:hanging="360"/>
+      </w:pPr>
+      <w:rPr>
+        <w:rFonts w:hint="default"/>
+      </w:rPr>
+    </w:lvl>
+    <w:lvl w:ilvl="1" w:tplc="04090019" w:tentative="1">
+      <w:start w:val="1"/>
+      <w:numFmt w:val="lowerLetter"/>
+      <w:lvlText w:val="%2."/>
+      <w:lvlJc w:val="left"/>
+      <w:pPr>
+        <w:ind w:left="1440" w:hanging="360"/>
+      </w:pPr>
+    </w:lvl>
+    <w:lvl w:ilvl="2" w:tplc="0409001B" w:tentative="1">
+      <w:start w:val="1"/>
+      <w:numFmt w:val="lowerRoman"/>
+      <w:lvlText w:val="%3."/>
+      <w:lvlJc w:val="right"/>
+      <w:pPr>
+        <w:ind w:left="2160" w:hanging="180"/>
+      </w:pPr>
+    </w:lvl>
+    <w:lvl w:ilvl="3" w:tplc="0409000F" w:tentative="1">
+      <w:start w:val="1"/>
+      <w:numFmt w:val="decimal"/>
+      <w:lvlText w:val="%4."/>
+      <w:lvlJc w:val="left"/>
+      <w:pPr>
+        <w:ind w:left="2880" w:hanging="360"/>
+      </w:pPr>
+    </w:lvl>
+    <w:lvl w:ilvl="4" w:tplc="04090019" w:tentative="1">
+      <w:start w:val="1"/>
+      <w:numFmt w:val="lowerLetter"/>
+      <w:lvlText w:val="%5."/>
+      <w:lvlJc w:val="left"/>
+      <w:pPr>
+        <w:ind w:left="3600" w:hanging="360"/>
+      </w:pPr>
+    </w:lvl>
+    <w:lvl w:ilvl="5" w:tplc="0409001B" w:tentative="1">
+      <w:start w:val="1"/>
+      <w:numFmt w:val="lowerRoman"/>
+      <w:lvlText w:val="%6."/>
+      <w:lvlJc w:val="right"/>
+      <w:pPr>
+        <w:ind w:left="4320" w:hanging="180"/>
+      </w:pPr>
+    </w:lvl>
+    <w:lvl w:ilvl="6" w:tplc="0409000F" w:tentative="1">
+      <w:start w:val="1"/>
+      <w:numFmt w:val="decimal"/>
+      <w:lvlText w:val="%7."/>
+      <w:lvlJc w:val="left"/>
+      <w:pPr>
+        <w:ind w:left="5040" w:hanging="360"/>
+      </w:pPr>
+    </w:lvl>
+    <w:lvl w:ilvl="7" w:tplc="04090019" w:tentative="1">
+      <w:start w:val="1"/>
+      <w:numFmt w:val="lowerLetter"/>
+      <w:lvlText w:val="%8."/>
+      <w:lvlJc w:val="left"/>
+      <w:pPr>
+        <w:ind w:left="5760" w:hanging="360"/>
+      </w:pPr>
+    </w:lvl>
+    <w:lvl w:ilvl="8" w:tplc="0409001B" w:tentative="1">
+      <w:start w:val="1"/>
+      <w:numFmt w:val="lowerRoman"/>
+      <w:lvlText w:val="%9."/>
+      <w:lvlJc w:val="right"/>
+      <w:pPr>
+        <w:ind w:left="6480" w:hanging="180"/>
+      </w:pPr>
+    </w:lvl>
+  </w:abstractNum>
+  <w:abstractNum w:abstractNumId="12" w15:restartNumberingAfterBreak="0">
+    <w:nsid w:val="17694953"/>
+    <w:multiLevelType w:val="hybridMultilevel"/>
+    <w:tmpl w:val="7AB27BC8"/>
+    <w:lvl w:ilvl="0" w:tplc="0409000F">
+      <w:start w:val="1"/>
+      <w:numFmt w:val="decimal"/>
+      <w:lvlText w:val="%1."/>
+      <w:lvlJc w:val="left"/>
+      <w:pPr>
+        <w:ind w:left="360" w:hanging="360"/>
+      </w:pPr>
+      <w:rPr>
+        <w:rFonts w:hint="default"/>
+      </w:rPr>
+    </w:lvl>
+    <w:lvl w:ilvl="1" w:tplc="FFFFFFFF" w:tentative="1">
+      <w:start w:val="1"/>
+      <w:numFmt w:val="bullet"/>
+      <w:lvlText w:val="o"/>
+      <w:lvlJc w:val="left"/>
+      <w:pPr>
+        <w:ind w:left="1080" w:hanging="360"/>
+      </w:pPr>
+      <w:rPr>
+        <w:rFonts w:ascii="Courier New" w:hAnsi="Courier New" w:cs="Courier New" w:hint="default"/>
+      </w:rPr>
+    </w:lvl>
+    <w:lvl w:ilvl="2" w:tplc="FFFFFFFF" w:tentative="1">
+      <w:start w:val="1"/>
+      <w:numFmt w:val="bullet"/>
+      <w:lvlText w:val=""/>
+      <w:lvlJc w:val="left"/>
+      <w:pPr>
+        <w:ind w:left="1800" w:hanging="360"/>
+      </w:pPr>
+      <w:rPr>
+        <w:rFonts w:ascii="Wingdings" w:hAnsi="Wingdings" w:hint="default"/>
+      </w:rPr>
+    </w:lvl>
+    <w:lvl w:ilvl="3" w:tplc="FFFFFFFF" w:tentative="1">
+      <w:start w:val="1"/>
+      <w:numFmt w:val="bullet"/>
+      <w:lvlText w:val=""/>
+      <w:lvlJc w:val="left"/>
+      <w:pPr>
+        <w:ind w:left="2520" w:hanging="360"/>
+      </w:pPr>
+      <w:rPr>
+        <w:rFonts w:ascii="Symbol" w:hAnsi="Symbol" w:hint="default"/>
+      </w:rPr>
+    </w:lvl>
+    <w:lvl w:ilvl="4" w:tplc="FFFFFFFF" w:tentative="1">
+      <w:start w:val="1"/>
+      <w:numFmt w:val="bullet"/>
+      <w:lvlText w:val="o"/>
+      <w:lvlJc w:val="left"/>
+      <w:pPr>
+        <w:ind w:left="3240" w:hanging="360"/>
+      </w:pPr>
+      <w:rPr>
+        <w:rFonts w:ascii="Courier New" w:hAnsi="Courier New" w:cs="Courier New" w:hint="default"/>
+      </w:rPr>
+    </w:lvl>
+    <w:lvl w:ilvl="5" w:tplc="FFFFFFFF" w:tentative="1">
+      <w:start w:val="1"/>
+      <w:numFmt w:val="bullet"/>
+      <w:lvlText w:val=""/>
+      <w:lvlJc w:val="left"/>
+      <w:pPr>
+        <w:ind w:left="3960" w:hanging="360"/>
+      </w:pPr>
+      <w:rPr>
+        <w:rFonts w:ascii="Wingdings" w:hAnsi="Wingdings" w:hint="default"/>
+      </w:rPr>
+    </w:lvl>
+    <w:lvl w:ilvl="6" w:tplc="FFFFFFFF" w:tentative="1">
+      <w:start w:val="1"/>
+      <w:numFmt w:val="bullet"/>
+      <w:lvlText w:val=""/>
+      <w:lvlJc w:val="left"/>
+      <w:pPr>
+        <w:ind w:left="4680" w:hanging="360"/>
+      </w:pPr>
+      <w:rPr>
+        <w:rFonts w:ascii="Symbol" w:hAnsi="Symbol" w:hint="default"/>
+      </w:rPr>
+    </w:lvl>
+    <w:lvl w:ilvl="7" w:tplc="FFFFFFFF" w:tentative="1">
+      <w:start w:val="1"/>
+      <w:numFmt w:val="bullet"/>
+      <w:lvlText w:val="o"/>
+      <w:lvlJc w:val="left"/>
+      <w:pPr>
+        <w:ind w:left="5400" w:hanging="360"/>
+      </w:pPr>
+      <w:rPr>
+        <w:rFonts w:ascii="Courier New" w:hAnsi="Courier New" w:cs="Courier New" w:hint="default"/>
+      </w:rPr>
+    </w:lvl>
+    <w:lvl w:ilvl="8" w:tplc="FFFFFFFF" w:tentative="1">
+      <w:start w:val="1"/>
+      <w:numFmt w:val="bullet"/>
+      <w:lvlText w:val=""/>
+      <w:lvlJc w:val="left"/>
+      <w:pPr>
+        <w:ind w:left="6120" w:hanging="360"/>
+      </w:pPr>
+      <w:rPr>
+        <w:rFonts w:ascii="Wingdings" w:hAnsi="Wingdings" w:hint="default"/>
+      </w:rPr>
+    </w:lvl>
+  </w:abstractNum>
+  <w:abstractNum w:abstractNumId="13" w15:restartNumberingAfterBreak="0">
+    <w:nsid w:val="20046EE8"/>
+    <w:multiLevelType w:val="hybridMultilevel"/>
+    <w:tmpl w:val="15827EF8"/>
+    <w:lvl w:ilvl="0" w:tplc="04090001">
+      <w:start w:val="1"/>
+      <w:numFmt w:val="bullet"/>
+      <w:lvlText w:val=""/>
+      <w:lvlJc w:val="left"/>
+      <w:pPr>
+        <w:ind w:left="720" w:hanging="360"/>
+      </w:pPr>
+      <w:rPr>
+        <w:rFonts w:ascii="Symbol" w:hAnsi="Symbol" w:hint="default"/>
+      </w:rPr>
+    </w:lvl>
+    <w:lvl w:ilvl="1" w:tplc="04090003" w:tentative="1">
+      <w:start w:val="1"/>
+      <w:numFmt w:val="bullet"/>
+      <w:lvlText w:val="o"/>
+      <w:lvlJc w:val="left"/>
+      <w:pPr>
+        <w:ind w:left="1440" w:hanging="360"/>
+      </w:pPr>
+      <w:rPr>
+        <w:rFonts w:ascii="Courier New" w:hAnsi="Courier New" w:cs="Courier New" w:hint="default"/>
+      </w:rPr>
+    </w:lvl>
+    <w:lvl w:ilvl="2" w:tplc="04090005" w:tentative="1">
+      <w:start w:val="1"/>
+      <w:numFmt w:val="bullet"/>
+      <w:lvlText w:val=""/>
+      <w:lvlJc w:val="left"/>
+      <w:pPr>
+        <w:ind w:left="2160" w:hanging="360"/>
+      </w:pPr>
+      <w:rPr>
+        <w:rFonts w:ascii="Wingdings" w:hAnsi="Wingdings" w:hint="default"/>
+      </w:rPr>
+    </w:lvl>
+    <w:lvl w:ilvl="3" w:tplc="04090001" w:tentative="1">
+      <w:start w:val="1"/>
+      <w:numFmt w:val="bullet"/>
+      <w:lvlText w:val=""/>
+      <w:lvlJc w:val="left"/>
+      <w:pPr>
+        <w:ind w:left="2880" w:hanging="360"/>
+      </w:pPr>
+      <w:rPr>
+        <w:rFonts w:ascii="Symbol" w:hAnsi="Symbol" w:hint="default"/>
+      </w:rPr>
+    </w:lvl>
+    <w:lvl w:ilvl="4" w:tplc="04090003" w:tentative="1">
+      <w:start w:val="1"/>
+      <w:numFmt w:val="bullet"/>
+      <w:lvlText w:val="o"/>
+      <w:lvlJc w:val="left"/>
+      <w:pPr>
+        <w:ind w:left="3600" w:hanging="360"/>
+      </w:pPr>
+      <w:rPr>
+        <w:rFonts w:ascii="Courier New" w:hAnsi="Courier New" w:cs="Courier New" w:hint="default"/>
+      </w:rPr>
+    </w:lvl>
+    <w:lvl w:ilvl="5" w:tplc="04090005" w:tentative="1">
+      <w:start w:val="1"/>
+      <w:numFmt w:val="bullet"/>
+      <w:lvlText w:val=""/>
+      <w:lvlJc w:val="left"/>
+      <w:pPr>
+        <w:ind w:left="4320" w:hanging="360"/>
+      </w:pPr>
+      <w:rPr>
+        <w:rFonts w:ascii="Wingdings" w:hAnsi="Wingdings" w:hint="default"/>
+      </w:rPr>
+    </w:lvl>
+    <w:lvl w:ilvl="6" w:tplc="04090001" w:tentative="1">
+      <w:start w:val="1"/>
+      <w:numFmt w:val="bullet"/>
+      <w:lvlText w:val=""/>
+      <w:lvlJc w:val="left"/>
+      <w:pPr>
+        <w:ind w:left="5040" w:hanging="360"/>
+      </w:pPr>
+      <w:rPr>
+        <w:rFonts w:ascii="Symbol" w:hAnsi="Symbol" w:hint="default"/>
+      </w:rPr>
+    </w:lvl>
+    <w:lvl w:ilvl="7" w:tplc="04090003" w:tentative="1">
+      <w:start w:val="1"/>
+      <w:numFmt w:val="bullet"/>
+      <w:lvlText w:val="o"/>
+      <w:lvlJc w:val="left"/>
+      <w:pPr>
+        <w:ind w:left="5760" w:hanging="360"/>
+      </w:pPr>
+      <w:rPr>
+        <w:rFonts w:ascii="Courier New" w:hAnsi="Courier New" w:cs="Courier New" w:hint="default"/>
+      </w:rPr>
+    </w:lvl>
+    <w:lvl w:ilvl="8" w:tplc="04090005" w:tentative="1">
+      <w:start w:val="1"/>
+      <w:numFmt w:val="bullet"/>
+      <w:lvlText w:val=""/>
+      <w:lvlJc w:val="left"/>
+      <w:pPr>
+        <w:ind w:left="6480" w:hanging="360"/>
+      </w:pPr>
+      <w:rPr>
+        <w:rFonts w:ascii="Wingdings" w:hAnsi="Wingdings" w:hint="default"/>
+      </w:rPr>
+    </w:lvl>
+  </w:abstractNum>
+  <w:abstractNum w:abstractNumId="14" w15:restartNumberingAfterBreak="0">
     <w:nsid w:val="26C50F06"/>
     <w:multiLevelType w:val="multilevel"/>
     <w:tmpl w:val="FA9E4CCC"/>
@@ -7398,7 +10577,7 @@
       </w:rPr>
     </w:lvl>
   </w:abstractNum>
-  <w:abstractNum w:abstractNumId="10" w15:restartNumberingAfterBreak="0">
+  <w:abstractNum w:abstractNumId="15" w15:restartNumberingAfterBreak="0">
     <w:nsid w:val="2D4B5795"/>
     <w:multiLevelType w:val="multilevel"/>
     <w:tmpl w:val="90FA6C7E"/>
@@ -7547,7 +10726,7 @@
       </w:rPr>
     </w:lvl>
   </w:abstractNum>
-  <w:abstractNum w:abstractNumId="11" w15:restartNumberingAfterBreak="0">
+  <w:abstractNum w:abstractNumId="16" w15:restartNumberingAfterBreak="0">
     <w:nsid w:val="3708711C"/>
     <w:multiLevelType w:val="multilevel"/>
     <w:tmpl w:val="2046749E"/>
@@ -7696,7 +10875,99 @@
       </w:rPr>
     </w:lvl>
   </w:abstractNum>
-  <w:abstractNum w:abstractNumId="12" w15:restartNumberingAfterBreak="0">
+  <w:abstractNum w:abstractNumId="17" w15:restartNumberingAfterBreak="0">
+    <w:nsid w:val="393E2C67"/>
+    <w:multiLevelType w:val="hybridMultilevel"/>
+    <w:tmpl w:val="F934F9F6"/>
+    <w:lvl w:ilvl="0" w:tplc="27A8A2F4">
+      <w:start w:val="1"/>
+      <w:numFmt w:val="decimal"/>
+      <w:lvlText w:val="%1."/>
+      <w:lvlJc w:val="left"/>
+      <w:pPr>
+        <w:ind w:left="360" w:hanging="360"/>
+      </w:pPr>
+      <w:rPr>
+        <w:rFonts w:ascii="Aptos Narrow" w:eastAsia="Times New Roman" w:hAnsi="Aptos Narrow" w:cs="Times New Roman" w:hint="default"/>
+        <w:b w:val="0"/>
+        <w:color w:val="000000"/>
+        <w:sz w:val="22"/>
+      </w:rPr>
+    </w:lvl>
+    <w:lvl w:ilvl="1" w:tplc="04090019" w:tentative="1">
+      <w:start w:val="1"/>
+      <w:numFmt w:val="lowerLetter"/>
+      <w:lvlText w:val="%2."/>
+      <w:lvlJc w:val="left"/>
+      <w:pPr>
+        <w:ind w:left="1080" w:hanging="360"/>
+      </w:pPr>
+    </w:lvl>
+    <w:lvl w:ilvl="2" w:tplc="0409001B" w:tentative="1">
+      <w:start w:val="1"/>
+      <w:numFmt w:val="lowerRoman"/>
+      <w:lvlText w:val="%3."/>
+      <w:lvlJc w:val="right"/>
+      <w:pPr>
+        <w:ind w:left="1800" w:hanging="180"/>
+      </w:pPr>
+    </w:lvl>
+    <w:lvl w:ilvl="3" w:tplc="0409000F" w:tentative="1">
+      <w:start w:val="1"/>
+      <w:numFmt w:val="decimal"/>
+      <w:lvlText w:val="%4."/>
+      <w:lvlJc w:val="left"/>
+      <w:pPr>
+        <w:ind w:left="2520" w:hanging="360"/>
+      </w:pPr>
+    </w:lvl>
+    <w:lvl w:ilvl="4" w:tplc="04090019" w:tentative="1">
+      <w:start w:val="1"/>
+      <w:numFmt w:val="lowerLetter"/>
+      <w:lvlText w:val="%5."/>
+      <w:lvlJc w:val="left"/>
+      <w:pPr>
+        <w:ind w:left="3240" w:hanging="360"/>
+      </w:pPr>
+    </w:lvl>
+    <w:lvl w:ilvl="5" w:tplc="0409001B" w:tentative="1">
+      <w:start w:val="1"/>
+      <w:numFmt w:val="lowerRoman"/>
+      <w:lvlText w:val="%6."/>
+      <w:lvlJc w:val="right"/>
+      <w:pPr>
+        <w:ind w:left="3960" w:hanging="180"/>
+      </w:pPr>
+    </w:lvl>
+    <w:lvl w:ilvl="6" w:tplc="0409000F" w:tentative="1">
+      <w:start w:val="1"/>
+      <w:numFmt w:val="decimal"/>
+      <w:lvlText w:val="%7."/>
+      <w:lvlJc w:val="left"/>
+      <w:pPr>
+        <w:ind w:left="4680" w:hanging="360"/>
+      </w:pPr>
+    </w:lvl>
+    <w:lvl w:ilvl="7" w:tplc="04090019" w:tentative="1">
+      <w:start w:val="1"/>
+      <w:numFmt w:val="lowerLetter"/>
+      <w:lvlText w:val="%8."/>
+      <w:lvlJc w:val="left"/>
+      <w:pPr>
+        <w:ind w:left="5400" w:hanging="360"/>
+      </w:pPr>
+    </w:lvl>
+    <w:lvl w:ilvl="8" w:tplc="0409001B" w:tentative="1">
+      <w:start w:val="1"/>
+      <w:numFmt w:val="lowerRoman"/>
+      <w:lvlText w:val="%9."/>
+      <w:lvlJc w:val="right"/>
+      <w:pPr>
+        <w:ind w:left="6120" w:hanging="180"/>
+      </w:pPr>
+    </w:lvl>
+  </w:abstractNum>
+  <w:abstractNum w:abstractNumId="18" w15:restartNumberingAfterBreak="0">
     <w:nsid w:val="3A7C674F"/>
     <w:multiLevelType w:val="multilevel"/>
     <w:tmpl w:val="F8463494"/>
@@ -7845,7 +11116,7 @@
       </w:rPr>
     </w:lvl>
   </w:abstractNum>
-  <w:abstractNum w:abstractNumId="13" w15:restartNumberingAfterBreak="0">
+  <w:abstractNum w:abstractNumId="19" w15:restartNumberingAfterBreak="0">
     <w:nsid w:val="41093EB5"/>
     <w:multiLevelType w:val="multilevel"/>
     <w:tmpl w:val="D040B3F8"/>
@@ -7994,7 +11265,7 @@
       </w:rPr>
     </w:lvl>
   </w:abstractNum>
-  <w:abstractNum w:abstractNumId="14" w15:restartNumberingAfterBreak="0">
+  <w:abstractNum w:abstractNumId="20" w15:restartNumberingAfterBreak="0">
     <w:nsid w:val="43B83212"/>
     <w:multiLevelType w:val="multilevel"/>
     <w:tmpl w:val="51B020A6"/>
@@ -8143,7 +11414,7 @@
       </w:rPr>
     </w:lvl>
   </w:abstractNum>
-  <w:abstractNum w:abstractNumId="15" w15:restartNumberingAfterBreak="0">
+  <w:abstractNum w:abstractNumId="21" w15:restartNumberingAfterBreak="0">
     <w:nsid w:val="4D394975"/>
     <w:multiLevelType w:val="multilevel"/>
     <w:tmpl w:val="8BEC6426"/>
@@ -8292,7 +11563,7 @@
       </w:rPr>
     </w:lvl>
   </w:abstractNum>
-  <w:abstractNum w:abstractNumId="16" w15:restartNumberingAfterBreak="0">
+  <w:abstractNum w:abstractNumId="22" w15:restartNumberingAfterBreak="0">
     <w:nsid w:val="5BF169D2"/>
     <w:multiLevelType w:val="multilevel"/>
     <w:tmpl w:val="E3E8FB98"/>
@@ -8441,7 +11712,459 @@
       </w:rPr>
     </w:lvl>
   </w:abstractNum>
-  <w:abstractNum w:abstractNumId="17" w15:restartNumberingAfterBreak="0">
+  <w:abstractNum w:abstractNumId="23" w15:restartNumberingAfterBreak="0">
+    <w:nsid w:val="5F841B4D"/>
+    <w:multiLevelType w:val="hybridMultilevel"/>
+    <w:tmpl w:val="06EA79F8"/>
+    <w:lvl w:ilvl="0" w:tplc="04090001">
+      <w:start w:val="1"/>
+      <w:numFmt w:val="bullet"/>
+      <w:lvlText w:val=""/>
+      <w:lvlJc w:val="left"/>
+      <w:pPr>
+        <w:ind w:left="720" w:hanging="360"/>
+      </w:pPr>
+      <w:rPr>
+        <w:rFonts w:ascii="Symbol" w:hAnsi="Symbol" w:hint="default"/>
+      </w:rPr>
+    </w:lvl>
+    <w:lvl w:ilvl="1" w:tplc="04090003" w:tentative="1">
+      <w:start w:val="1"/>
+      <w:numFmt w:val="bullet"/>
+      <w:lvlText w:val="o"/>
+      <w:lvlJc w:val="left"/>
+      <w:pPr>
+        <w:ind w:left="1440" w:hanging="360"/>
+      </w:pPr>
+      <w:rPr>
+        <w:rFonts w:ascii="Courier New" w:hAnsi="Courier New" w:cs="Courier New" w:hint="default"/>
+      </w:rPr>
+    </w:lvl>
+    <w:lvl w:ilvl="2" w:tplc="04090005" w:tentative="1">
+      <w:start w:val="1"/>
+      <w:numFmt w:val="bullet"/>
+      <w:lvlText w:val=""/>
+      <w:lvlJc w:val="left"/>
+      <w:pPr>
+        <w:ind w:left="2160" w:hanging="360"/>
+      </w:pPr>
+      <w:rPr>
+        <w:rFonts w:ascii="Wingdings" w:hAnsi="Wingdings" w:hint="default"/>
+      </w:rPr>
+    </w:lvl>
+    <w:lvl w:ilvl="3" w:tplc="04090001" w:tentative="1">
+      <w:start w:val="1"/>
+      <w:numFmt w:val="bullet"/>
+      <w:lvlText w:val=""/>
+      <w:lvlJc w:val="left"/>
+      <w:pPr>
+        <w:ind w:left="2880" w:hanging="360"/>
+      </w:pPr>
+      <w:rPr>
+        <w:rFonts w:ascii="Symbol" w:hAnsi="Symbol" w:hint="default"/>
+      </w:rPr>
+    </w:lvl>
+    <w:lvl w:ilvl="4" w:tplc="04090003" w:tentative="1">
+      <w:start w:val="1"/>
+      <w:numFmt w:val="bullet"/>
+      <w:lvlText w:val="o"/>
+      <w:lvlJc w:val="left"/>
+      <w:pPr>
+        <w:ind w:left="3600" w:hanging="360"/>
+      </w:pPr>
+      <w:rPr>
+        <w:rFonts w:ascii="Courier New" w:hAnsi="Courier New" w:cs="Courier New" w:hint="default"/>
+      </w:rPr>
+    </w:lvl>
+    <w:lvl w:ilvl="5" w:tplc="04090005" w:tentative="1">
+      <w:start w:val="1"/>
+      <w:numFmt w:val="bullet"/>
+      <w:lvlText w:val=""/>
+      <w:lvlJc w:val="left"/>
+      <w:pPr>
+        <w:ind w:left="4320" w:hanging="360"/>
+      </w:pPr>
+      <w:rPr>
+        <w:rFonts w:ascii="Wingdings" w:hAnsi="Wingdings" w:hint="default"/>
+      </w:rPr>
+    </w:lvl>
+    <w:lvl w:ilvl="6" w:tplc="04090001" w:tentative="1">
+      <w:start w:val="1"/>
+      <w:numFmt w:val="bullet"/>
+      <w:lvlText w:val=""/>
+      <w:lvlJc w:val="left"/>
+      <w:pPr>
+        <w:ind w:left="5040" w:hanging="360"/>
+      </w:pPr>
+      <w:rPr>
+        <w:rFonts w:ascii="Symbol" w:hAnsi="Symbol" w:hint="default"/>
+      </w:rPr>
+    </w:lvl>
+    <w:lvl w:ilvl="7" w:tplc="04090003" w:tentative="1">
+      <w:start w:val="1"/>
+      <w:numFmt w:val="bullet"/>
+      <w:lvlText w:val="o"/>
+      <w:lvlJc w:val="left"/>
+      <w:pPr>
+        <w:ind w:left="5760" w:hanging="360"/>
+      </w:pPr>
+      <w:rPr>
+        <w:rFonts w:ascii="Courier New" w:hAnsi="Courier New" w:cs="Courier New" w:hint="default"/>
+      </w:rPr>
+    </w:lvl>
+    <w:lvl w:ilvl="8" w:tplc="04090005" w:tentative="1">
+      <w:start w:val="1"/>
+      <w:numFmt w:val="bullet"/>
+      <w:lvlText w:val=""/>
+      <w:lvlJc w:val="left"/>
+      <w:pPr>
+        <w:ind w:left="6480" w:hanging="360"/>
+      </w:pPr>
+      <w:rPr>
+        <w:rFonts w:ascii="Wingdings" w:hAnsi="Wingdings" w:hint="default"/>
+      </w:rPr>
+    </w:lvl>
+  </w:abstractNum>
+  <w:abstractNum w:abstractNumId="24" w15:restartNumberingAfterBreak="0">
+    <w:nsid w:val="5F9233D5"/>
+    <w:multiLevelType w:val="hybridMultilevel"/>
+    <w:tmpl w:val="7D7A3E28"/>
+    <w:lvl w:ilvl="0" w:tplc="04090001">
+      <w:start w:val="1"/>
+      <w:numFmt w:val="bullet"/>
+      <w:lvlText w:val=""/>
+      <w:lvlJc w:val="left"/>
+      <w:pPr>
+        <w:ind w:left="720" w:hanging="360"/>
+      </w:pPr>
+      <w:rPr>
+        <w:rFonts w:ascii="Symbol" w:hAnsi="Symbol" w:hint="default"/>
+      </w:rPr>
+    </w:lvl>
+    <w:lvl w:ilvl="1" w:tplc="04090003" w:tentative="1">
+      <w:start w:val="1"/>
+      <w:numFmt w:val="bullet"/>
+      <w:lvlText w:val="o"/>
+      <w:lvlJc w:val="left"/>
+      <w:pPr>
+        <w:ind w:left="1440" w:hanging="360"/>
+      </w:pPr>
+      <w:rPr>
+        <w:rFonts w:ascii="Courier New" w:hAnsi="Courier New" w:cs="Courier New" w:hint="default"/>
+      </w:rPr>
+    </w:lvl>
+    <w:lvl w:ilvl="2" w:tplc="04090005" w:tentative="1">
+      <w:start w:val="1"/>
+      <w:numFmt w:val="bullet"/>
+      <w:lvlText w:val=""/>
+      <w:lvlJc w:val="left"/>
+      <w:pPr>
+        <w:ind w:left="2160" w:hanging="360"/>
+      </w:pPr>
+      <w:rPr>
+        <w:rFonts w:ascii="Wingdings" w:hAnsi="Wingdings" w:hint="default"/>
+      </w:rPr>
+    </w:lvl>
+    <w:lvl w:ilvl="3" w:tplc="04090001" w:tentative="1">
+      <w:start w:val="1"/>
+      <w:numFmt w:val="bullet"/>
+      <w:lvlText w:val=""/>
+      <w:lvlJc w:val="left"/>
+      <w:pPr>
+        <w:ind w:left="2880" w:hanging="360"/>
+      </w:pPr>
+      <w:rPr>
+        <w:rFonts w:ascii="Symbol" w:hAnsi="Symbol" w:hint="default"/>
+      </w:rPr>
+    </w:lvl>
+    <w:lvl w:ilvl="4" w:tplc="04090003" w:tentative="1">
+      <w:start w:val="1"/>
+      <w:numFmt w:val="bullet"/>
+      <w:lvlText w:val="o"/>
+      <w:lvlJc w:val="left"/>
+      <w:pPr>
+        <w:ind w:left="3600" w:hanging="360"/>
+      </w:pPr>
+      <w:rPr>
+        <w:rFonts w:ascii="Courier New" w:hAnsi="Courier New" w:cs="Courier New" w:hint="default"/>
+      </w:rPr>
+    </w:lvl>
+    <w:lvl w:ilvl="5" w:tplc="04090005" w:tentative="1">
+      <w:start w:val="1"/>
+      <w:numFmt w:val="bullet"/>
+      <w:lvlText w:val=""/>
+      <w:lvlJc w:val="left"/>
+      <w:pPr>
+        <w:ind w:left="4320" w:hanging="360"/>
+      </w:pPr>
+      <w:rPr>
+        <w:rFonts w:ascii="Wingdings" w:hAnsi="Wingdings" w:hint="default"/>
+      </w:rPr>
+    </w:lvl>
+    <w:lvl w:ilvl="6" w:tplc="04090001" w:tentative="1">
+      <w:start w:val="1"/>
+      <w:numFmt w:val="bullet"/>
+      <w:lvlText w:val=""/>
+      <w:lvlJc w:val="left"/>
+      <w:pPr>
+        <w:ind w:left="5040" w:hanging="360"/>
+      </w:pPr>
+      <w:rPr>
+        <w:rFonts w:ascii="Symbol" w:hAnsi="Symbol" w:hint="default"/>
+      </w:rPr>
+    </w:lvl>
+    <w:lvl w:ilvl="7" w:tplc="04090003" w:tentative="1">
+      <w:start w:val="1"/>
+      <w:numFmt w:val="bullet"/>
+      <w:lvlText w:val="o"/>
+      <w:lvlJc w:val="left"/>
+      <w:pPr>
+        <w:ind w:left="5760" w:hanging="360"/>
+      </w:pPr>
+      <w:rPr>
+        <w:rFonts w:ascii="Courier New" w:hAnsi="Courier New" w:cs="Courier New" w:hint="default"/>
+      </w:rPr>
+    </w:lvl>
+    <w:lvl w:ilvl="8" w:tplc="04090005" w:tentative="1">
+      <w:start w:val="1"/>
+      <w:numFmt w:val="bullet"/>
+      <w:lvlText w:val=""/>
+      <w:lvlJc w:val="left"/>
+      <w:pPr>
+        <w:ind w:left="6480" w:hanging="360"/>
+      </w:pPr>
+      <w:rPr>
+        <w:rFonts w:ascii="Wingdings" w:hAnsi="Wingdings" w:hint="default"/>
+      </w:rPr>
+    </w:lvl>
+  </w:abstractNum>
+  <w:abstractNum w:abstractNumId="25" w15:restartNumberingAfterBreak="0">
+    <w:nsid w:val="638B0B8C"/>
+    <w:multiLevelType w:val="hybridMultilevel"/>
+    <w:tmpl w:val="5232BDB2"/>
+    <w:lvl w:ilvl="0" w:tplc="04090001">
+      <w:start w:val="1"/>
+      <w:numFmt w:val="bullet"/>
+      <w:lvlText w:val=""/>
+      <w:lvlJc w:val="left"/>
+      <w:pPr>
+        <w:ind w:left="720" w:hanging="360"/>
+      </w:pPr>
+      <w:rPr>
+        <w:rFonts w:ascii="Symbol" w:hAnsi="Symbol" w:hint="default"/>
+      </w:rPr>
+    </w:lvl>
+    <w:lvl w:ilvl="1" w:tplc="04090003" w:tentative="1">
+      <w:start w:val="1"/>
+      <w:numFmt w:val="bullet"/>
+      <w:lvlText w:val="o"/>
+      <w:lvlJc w:val="left"/>
+      <w:pPr>
+        <w:ind w:left="1440" w:hanging="360"/>
+      </w:pPr>
+      <w:rPr>
+        <w:rFonts w:ascii="Courier New" w:hAnsi="Courier New" w:cs="Courier New" w:hint="default"/>
+      </w:rPr>
+    </w:lvl>
+    <w:lvl w:ilvl="2" w:tplc="04090005" w:tentative="1">
+      <w:start w:val="1"/>
+      <w:numFmt w:val="bullet"/>
+      <w:lvlText w:val=""/>
+      <w:lvlJc w:val="left"/>
+      <w:pPr>
+        <w:ind w:left="2160" w:hanging="360"/>
+      </w:pPr>
+      <w:rPr>
+        <w:rFonts w:ascii="Wingdings" w:hAnsi="Wingdings" w:hint="default"/>
+      </w:rPr>
+    </w:lvl>
+    <w:lvl w:ilvl="3" w:tplc="04090001" w:tentative="1">
+      <w:start w:val="1"/>
+      <w:numFmt w:val="bullet"/>
+      <w:lvlText w:val=""/>
+      <w:lvlJc w:val="left"/>
+      <w:pPr>
+        <w:ind w:left="2880" w:hanging="360"/>
+      </w:pPr>
+      <w:rPr>
+        <w:rFonts w:ascii="Symbol" w:hAnsi="Symbol" w:hint="default"/>
+      </w:rPr>
+    </w:lvl>
+    <w:lvl w:ilvl="4" w:tplc="04090003" w:tentative="1">
+      <w:start w:val="1"/>
+      <w:numFmt w:val="bullet"/>
+      <w:lvlText w:val="o"/>
+      <w:lvlJc w:val="left"/>
+      <w:pPr>
+        <w:ind w:left="3600" w:hanging="360"/>
+      </w:pPr>
+      <w:rPr>
+        <w:rFonts w:ascii="Courier New" w:hAnsi="Courier New" w:cs="Courier New" w:hint="default"/>
+      </w:rPr>
+    </w:lvl>
+    <w:lvl w:ilvl="5" w:tplc="04090005" w:tentative="1">
+      <w:start w:val="1"/>
+      <w:numFmt w:val="bullet"/>
+      <w:lvlText w:val=""/>
+      <w:lvlJc w:val="left"/>
+      <w:pPr>
+        <w:ind w:left="4320" w:hanging="360"/>
+      </w:pPr>
+      <w:rPr>
+        <w:rFonts w:ascii="Wingdings" w:hAnsi="Wingdings" w:hint="default"/>
+      </w:rPr>
+    </w:lvl>
+    <w:lvl w:ilvl="6" w:tplc="04090001" w:tentative="1">
+      <w:start w:val="1"/>
+      <w:numFmt w:val="bullet"/>
+      <w:lvlText w:val=""/>
+      <w:lvlJc w:val="left"/>
+      <w:pPr>
+        <w:ind w:left="5040" w:hanging="360"/>
+      </w:pPr>
+      <w:rPr>
+        <w:rFonts w:ascii="Symbol" w:hAnsi="Symbol" w:hint="default"/>
+      </w:rPr>
+    </w:lvl>
+    <w:lvl w:ilvl="7" w:tplc="04090003" w:tentative="1">
+      <w:start w:val="1"/>
+      <w:numFmt w:val="bullet"/>
+      <w:lvlText w:val="o"/>
+      <w:lvlJc w:val="left"/>
+      <w:pPr>
+        <w:ind w:left="5760" w:hanging="360"/>
+      </w:pPr>
+      <w:rPr>
+        <w:rFonts w:ascii="Courier New" w:hAnsi="Courier New" w:cs="Courier New" w:hint="default"/>
+      </w:rPr>
+    </w:lvl>
+    <w:lvl w:ilvl="8" w:tplc="04090005" w:tentative="1">
+      <w:start w:val="1"/>
+      <w:numFmt w:val="bullet"/>
+      <w:lvlText w:val=""/>
+      <w:lvlJc w:val="left"/>
+      <w:pPr>
+        <w:ind w:left="6480" w:hanging="360"/>
+      </w:pPr>
+      <w:rPr>
+        <w:rFonts w:ascii="Wingdings" w:hAnsi="Wingdings" w:hint="default"/>
+      </w:rPr>
+    </w:lvl>
+  </w:abstractNum>
+  <w:abstractNum w:abstractNumId="26" w15:restartNumberingAfterBreak="0">
+    <w:nsid w:val="67724D3E"/>
+    <w:multiLevelType w:val="hybridMultilevel"/>
+    <w:tmpl w:val="FDE4B718"/>
+    <w:lvl w:ilvl="0" w:tplc="04090001">
+      <w:start w:val="1"/>
+      <w:numFmt w:val="bullet"/>
+      <w:lvlText w:val=""/>
+      <w:lvlJc w:val="left"/>
+      <w:pPr>
+        <w:ind w:left="720" w:hanging="360"/>
+      </w:pPr>
+      <w:rPr>
+        <w:rFonts w:ascii="Symbol" w:hAnsi="Symbol" w:hint="default"/>
+      </w:rPr>
+    </w:lvl>
+    <w:lvl w:ilvl="1" w:tplc="04090003" w:tentative="1">
+      <w:start w:val="1"/>
+      <w:numFmt w:val="bullet"/>
+      <w:lvlText w:val="o"/>
+      <w:lvlJc w:val="left"/>
+      <w:pPr>
+        <w:ind w:left="1440" w:hanging="360"/>
+      </w:pPr>
+      <w:rPr>
+        <w:rFonts w:ascii="Courier New" w:hAnsi="Courier New" w:cs="Courier New" w:hint="default"/>
+      </w:rPr>
+    </w:lvl>
+    <w:lvl w:ilvl="2" w:tplc="04090005" w:tentative="1">
+      <w:start w:val="1"/>
+      <w:numFmt w:val="bullet"/>
+      <w:lvlText w:val=""/>
+      <w:lvlJc w:val="left"/>
+      <w:pPr>
+        <w:ind w:left="2160" w:hanging="360"/>
+      </w:pPr>
+      <w:rPr>
+        <w:rFonts w:ascii="Wingdings" w:hAnsi="Wingdings" w:hint="default"/>
+      </w:rPr>
+    </w:lvl>
+    <w:lvl w:ilvl="3" w:tplc="04090001" w:tentative="1">
+      <w:start w:val="1"/>
+      <w:numFmt w:val="bullet"/>
+      <w:lvlText w:val=""/>
+      <w:lvlJc w:val="left"/>
+      <w:pPr>
+        <w:ind w:left="2880" w:hanging="360"/>
+      </w:pPr>
+      <w:rPr>
+        <w:rFonts w:ascii="Symbol" w:hAnsi="Symbol" w:hint="default"/>
+      </w:rPr>
+    </w:lvl>
+    <w:lvl w:ilvl="4" w:tplc="04090003" w:tentative="1">
+      <w:start w:val="1"/>
+      <w:numFmt w:val="bullet"/>
+      <w:lvlText w:val="o"/>
+      <w:lvlJc w:val="left"/>
+      <w:pPr>
+        <w:ind w:left="3600" w:hanging="360"/>
+      </w:pPr>
+      <w:rPr>
+        <w:rFonts w:ascii="Courier New" w:hAnsi="Courier New" w:cs="Courier New" w:hint="default"/>
+      </w:rPr>
+    </w:lvl>
+    <w:lvl w:ilvl="5" w:tplc="04090005" w:tentative="1">
+      <w:start w:val="1"/>
+      <w:numFmt w:val="bullet"/>
+      <w:lvlText w:val=""/>
+      <w:lvlJc w:val="left"/>
+      <w:pPr>
+        <w:ind w:left="4320" w:hanging="360"/>
+      </w:pPr>
+      <w:rPr>
+        <w:rFonts w:ascii="Wingdings" w:hAnsi="Wingdings" w:hint="default"/>
+      </w:rPr>
+    </w:lvl>
+    <w:lvl w:ilvl="6" w:tplc="04090001" w:tentative="1">
+      <w:start w:val="1"/>
+      <w:numFmt w:val="bullet"/>
+      <w:lvlText w:val=""/>
+      <w:lvlJc w:val="left"/>
+      <w:pPr>
+        <w:ind w:left="5040" w:hanging="360"/>
+      </w:pPr>
+      <w:rPr>
+        <w:rFonts w:ascii="Symbol" w:hAnsi="Symbol" w:hint="default"/>
+      </w:rPr>
+    </w:lvl>
+    <w:lvl w:ilvl="7" w:tplc="04090003" w:tentative="1">
+      <w:start w:val="1"/>
+      <w:numFmt w:val="bullet"/>
+      <w:lvlText w:val="o"/>
+      <w:lvlJc w:val="left"/>
+      <w:pPr>
+        <w:ind w:left="5760" w:hanging="360"/>
+      </w:pPr>
+      <w:rPr>
+        <w:rFonts w:ascii="Courier New" w:hAnsi="Courier New" w:cs="Courier New" w:hint="default"/>
+      </w:rPr>
+    </w:lvl>
+    <w:lvl w:ilvl="8" w:tplc="04090005" w:tentative="1">
+      <w:start w:val="1"/>
+      <w:numFmt w:val="bullet"/>
+      <w:lvlText w:val=""/>
+      <w:lvlJc w:val="left"/>
+      <w:pPr>
+        <w:ind w:left="6480" w:hanging="360"/>
+      </w:pPr>
+      <w:rPr>
+        <w:rFonts w:ascii="Wingdings" w:hAnsi="Wingdings" w:hint="default"/>
+      </w:rPr>
+    </w:lvl>
+  </w:abstractNum>
+  <w:abstractNum w:abstractNumId="27" w15:restartNumberingAfterBreak="0">
     <w:nsid w:val="69CA2DF6"/>
     <w:multiLevelType w:val="multilevel"/>
     <w:tmpl w:val="F9F6E4A2"/>
@@ -8590,7 +12313,120 @@
       </w:rPr>
     </w:lvl>
   </w:abstractNum>
-  <w:abstractNum w:abstractNumId="18" w15:restartNumberingAfterBreak="0">
+  <w:abstractNum w:abstractNumId="28" w15:restartNumberingAfterBreak="0">
+    <w:nsid w:val="6BE15928"/>
+    <w:multiLevelType w:val="hybridMultilevel"/>
+    <w:tmpl w:val="1ADCB4B6"/>
+    <w:lvl w:ilvl="0" w:tplc="04090001">
+      <w:start w:val="1"/>
+      <w:numFmt w:val="bullet"/>
+      <w:lvlText w:val=""/>
+      <w:lvlJc w:val="left"/>
+      <w:pPr>
+        <w:ind w:left="720" w:hanging="360"/>
+      </w:pPr>
+      <w:rPr>
+        <w:rFonts w:ascii="Symbol" w:hAnsi="Symbol" w:hint="default"/>
+      </w:rPr>
+    </w:lvl>
+    <w:lvl w:ilvl="1" w:tplc="04090003" w:tentative="1">
+      <w:start w:val="1"/>
+      <w:numFmt w:val="bullet"/>
+      <w:lvlText w:val="o"/>
+      <w:lvlJc w:val="left"/>
+      <w:pPr>
+        <w:ind w:left="1440" w:hanging="360"/>
+      </w:pPr>
+      <w:rPr>
+        <w:rFonts w:ascii="Courier New" w:hAnsi="Courier New" w:cs="Courier New" w:hint="default"/>
+      </w:rPr>
+    </w:lvl>
+    <w:lvl w:ilvl="2" w:tplc="04090005" w:tentative="1">
+      <w:start w:val="1"/>
+      <w:numFmt w:val="bullet"/>
+      <w:lvlText w:val=""/>
+      <w:lvlJc w:val="left"/>
+      <w:pPr>
+        <w:ind w:left="2160" w:hanging="360"/>
+      </w:pPr>
+      <w:rPr>
+        <w:rFonts w:ascii="Wingdings" w:hAnsi="Wingdings" w:hint="default"/>
+      </w:rPr>
+    </w:lvl>
+    <w:lvl w:ilvl="3" w:tplc="04090001" w:tentative="1">
+      <w:start w:val="1"/>
+      <w:numFmt w:val="bullet"/>
+      <w:lvlText w:val=""/>
+      <w:lvlJc w:val="left"/>
+      <w:pPr>
+        <w:ind w:left="2880" w:hanging="360"/>
+      </w:pPr>
+      <w:rPr>
+        <w:rFonts w:ascii="Symbol" w:hAnsi="Symbol" w:hint="default"/>
+      </w:rPr>
+    </w:lvl>
+    <w:lvl w:ilvl="4" w:tplc="04090003" w:tentative="1">
+      <w:start w:val="1"/>
+      <w:numFmt w:val="bullet"/>
+      <w:lvlText w:val="o"/>
+      <w:lvlJc w:val="left"/>
+      <w:pPr>
+        <w:ind w:left="3600" w:hanging="360"/>
+      </w:pPr>
+      <w:rPr>
+        <w:rFonts w:ascii="Courier New" w:hAnsi="Courier New" w:cs="Courier New" w:hint="default"/>
+      </w:rPr>
+    </w:lvl>
+    <w:lvl w:ilvl="5" w:tplc="04090005" w:tentative="1">
+      <w:start w:val="1"/>
+      <w:numFmt w:val="bullet"/>
+      <w:lvlText w:val=""/>
+      <w:lvlJc w:val="left"/>
+      <w:pPr>
+        <w:ind w:left="4320" w:hanging="360"/>
+      </w:pPr>
+      <w:rPr>
+        <w:rFonts w:ascii="Wingdings" w:hAnsi="Wingdings" w:hint="default"/>
+      </w:rPr>
+    </w:lvl>
+    <w:lvl w:ilvl="6" w:tplc="04090001" w:tentative="1">
+      <w:start w:val="1"/>
+      <w:numFmt w:val="bullet"/>
+      <w:lvlText w:val=""/>
+      <w:lvlJc w:val="left"/>
+      <w:pPr>
+        <w:ind w:left="5040" w:hanging="360"/>
+      </w:pPr>
+      <w:rPr>
+        <w:rFonts w:ascii="Symbol" w:hAnsi="Symbol" w:hint="default"/>
+      </w:rPr>
+    </w:lvl>
+    <w:lvl w:ilvl="7" w:tplc="04090003" w:tentative="1">
+      <w:start w:val="1"/>
+      <w:numFmt w:val="bullet"/>
+      <w:lvlText w:val="o"/>
+      <w:lvlJc w:val="left"/>
+      <w:pPr>
+        <w:ind w:left="5760" w:hanging="360"/>
+      </w:pPr>
+      <w:rPr>
+        <w:rFonts w:ascii="Courier New" w:hAnsi="Courier New" w:cs="Courier New" w:hint="default"/>
+      </w:rPr>
+    </w:lvl>
+    <w:lvl w:ilvl="8" w:tplc="04090005" w:tentative="1">
+      <w:start w:val="1"/>
+      <w:numFmt w:val="bullet"/>
+      <w:lvlText w:val=""/>
+      <w:lvlJc w:val="left"/>
+      <w:pPr>
+        <w:ind w:left="6480" w:hanging="360"/>
+      </w:pPr>
+      <w:rPr>
+        <w:rFonts w:ascii="Wingdings" w:hAnsi="Wingdings" w:hint="default"/>
+      </w:rPr>
+    </w:lvl>
+  </w:abstractNum>
+  <w:abstractNum w:abstractNumId="29" w15:restartNumberingAfterBreak="0">
     <w:nsid w:val="6C2B6AAD"/>
     <w:multiLevelType w:val="multilevel"/>
     <w:tmpl w:val="9CF28EA6"/>
@@ -8739,7 +12575,156 @@
       </w:rPr>
     </w:lvl>
   </w:abstractNum>
-  <w:abstractNum w:abstractNumId="19" w15:restartNumberingAfterBreak="0">
+  <w:abstractNum w:abstractNumId="30" w15:restartNumberingAfterBreak="0">
+    <w:nsid w:val="72DA54BD"/>
+    <w:multiLevelType w:val="multilevel"/>
+    <w:tmpl w:val="239A47B6"/>
+    <w:lvl w:ilvl="0">
+      <w:start w:val="1"/>
+      <w:numFmt w:val="bullet"/>
+      <w:lvlText w:val=""/>
+      <w:lvlJc w:val="left"/>
+      <w:pPr>
+        <w:tabs>
+          <w:tab w:val="num" w:pos="720"/>
+        </w:tabs>
+        <w:ind w:left="720" w:hanging="360"/>
+      </w:pPr>
+      <w:rPr>
+        <w:rFonts w:ascii="Symbol" w:hAnsi="Symbol" w:hint="default"/>
+        <w:sz w:val="20"/>
+      </w:rPr>
+    </w:lvl>
+    <w:lvl w:ilvl="1">
+      <w:start w:val="1"/>
+      <w:numFmt w:val="bullet"/>
+      <w:lvlText w:val="o"/>
+      <w:lvlJc w:val="left"/>
+      <w:pPr>
+        <w:tabs>
+          <w:tab w:val="num" w:pos="1440"/>
+        </w:tabs>
+        <w:ind w:left="1440" w:hanging="360"/>
+      </w:pPr>
+      <w:rPr>
+        <w:rFonts w:ascii="Courier New" w:hAnsi="Courier New" w:hint="default"/>
+        <w:sz w:val="20"/>
+      </w:rPr>
+    </w:lvl>
+    <w:lvl w:ilvl="2" w:tentative="1">
+      <w:start w:val="1"/>
+      <w:numFmt w:val="bullet"/>
+      <w:lvlText w:val=""/>
+      <w:lvlJc w:val="left"/>
+      <w:pPr>
+        <w:tabs>
+          <w:tab w:val="num" w:pos="2160"/>
+        </w:tabs>
+        <w:ind w:left="2160" w:hanging="360"/>
+      </w:pPr>
+      <w:rPr>
+        <w:rFonts w:ascii="Wingdings" w:hAnsi="Wingdings" w:hint="default"/>
+        <w:sz w:val="20"/>
+      </w:rPr>
+    </w:lvl>
+    <w:lvl w:ilvl="3" w:tentative="1">
+      <w:start w:val="1"/>
+      <w:numFmt w:val="bullet"/>
+      <w:lvlText w:val=""/>
+      <w:lvlJc w:val="left"/>
+      <w:pPr>
+        <w:tabs>
+          <w:tab w:val="num" w:pos="2880"/>
+        </w:tabs>
+        <w:ind w:left="2880" w:hanging="360"/>
+      </w:pPr>
+      <w:rPr>
+        <w:rFonts w:ascii="Wingdings" w:hAnsi="Wingdings" w:hint="default"/>
+        <w:sz w:val="20"/>
+      </w:rPr>
+    </w:lvl>
+    <w:lvl w:ilvl="4" w:tentative="1">
+      <w:start w:val="1"/>
+      <w:numFmt w:val="bullet"/>
+      <w:lvlText w:val=""/>
+      <w:lvlJc w:val="left"/>
+      <w:pPr>
+        <w:tabs>
+          <w:tab w:val="num" w:pos="3600"/>
+        </w:tabs>
+        <w:ind w:left="3600" w:hanging="360"/>
+      </w:pPr>
+      <w:rPr>
+        <w:rFonts w:ascii="Wingdings" w:hAnsi="Wingdings" w:hint="default"/>
+        <w:sz w:val="20"/>
+      </w:rPr>
+    </w:lvl>
+    <w:lvl w:ilvl="5" w:tentative="1">
+      <w:start w:val="1"/>
+      <w:numFmt w:val="bullet"/>
+      <w:lvlText w:val=""/>
+      <w:lvlJc w:val="left"/>
+      <w:pPr>
+        <w:tabs>
+          <w:tab w:val="num" w:pos="4320"/>
+        </w:tabs>
+        <w:ind w:left="4320" w:hanging="360"/>
+      </w:pPr>
+      <w:rPr>
+        <w:rFonts w:ascii="Wingdings" w:hAnsi="Wingdings" w:hint="default"/>
+        <w:sz w:val="20"/>
+      </w:rPr>
+    </w:lvl>
+    <w:lvl w:ilvl="6" w:tentative="1">
+      <w:start w:val="1"/>
+      <w:numFmt w:val="bullet"/>
+      <w:lvlText w:val=""/>
+      <w:lvlJc w:val="left"/>
+      <w:pPr>
+        <w:tabs>
+          <w:tab w:val="num" w:pos="5040"/>
+        </w:tabs>
+        <w:ind w:left="5040" w:hanging="360"/>
+      </w:pPr>
+      <w:rPr>
+        <w:rFonts w:ascii="Wingdings" w:hAnsi="Wingdings" w:hint="default"/>
+        <w:sz w:val="20"/>
+      </w:rPr>
+    </w:lvl>
+    <w:lvl w:ilvl="7" w:tentative="1">
+      <w:start w:val="1"/>
+      <w:numFmt w:val="bullet"/>
+      <w:lvlText w:val=""/>
+      <w:lvlJc w:val="left"/>
+      <w:pPr>
+        <w:tabs>
+          <w:tab w:val="num" w:pos="5760"/>
+        </w:tabs>
+        <w:ind w:left="5760" w:hanging="360"/>
+      </w:pPr>
+      <w:rPr>
+        <w:rFonts w:ascii="Wingdings" w:hAnsi="Wingdings" w:hint="default"/>
+        <w:sz w:val="20"/>
+      </w:rPr>
+    </w:lvl>
+    <w:lvl w:ilvl="8" w:tentative="1">
+      <w:start w:val="1"/>
+      <w:numFmt w:val="bullet"/>
+      <w:lvlText w:val=""/>
+      <w:lvlJc w:val="left"/>
+      <w:pPr>
+        <w:tabs>
+          <w:tab w:val="num" w:pos="6480"/>
+        </w:tabs>
+        <w:ind w:left="6480" w:hanging="360"/>
+      </w:pPr>
+      <w:rPr>
+        <w:rFonts w:ascii="Wingdings" w:hAnsi="Wingdings" w:hint="default"/>
+        <w:sz w:val="20"/>
+      </w:rPr>
+    </w:lvl>
+  </w:abstractNum>
+  <w:abstractNum w:abstractNumId="31" w15:restartNumberingAfterBreak="0">
     <w:nsid w:val="74DC5D36"/>
     <w:multiLevelType w:val="multilevel"/>
     <w:tmpl w:val="54DCF47C"/>
@@ -8888,7 +12873,7 @@
       </w:rPr>
     </w:lvl>
   </w:abstractNum>
-  <w:abstractNum w:abstractNumId="20" w15:restartNumberingAfterBreak="0">
+  <w:abstractNum w:abstractNumId="32" w15:restartNumberingAfterBreak="0">
     <w:nsid w:val="7F6D5DAF"/>
     <w:multiLevelType w:val="multilevel"/>
     <w:tmpl w:val="9DAE8AB0"/>
@@ -9041,64 +13026,100 @@
     <w:abstractNumId w:val="2"/>
   </w:num>
   <w:num w:numId="2" w16cid:durableId="1722511994">
-    <w:abstractNumId w:val="19"/>
+    <w:abstractNumId w:val="31"/>
   </w:num>
   <w:num w:numId="3" w16cid:durableId="380714662">
-    <w:abstractNumId w:val="20"/>
+    <w:abstractNumId w:val="32"/>
   </w:num>
   <w:num w:numId="4" w16cid:durableId="317226805">
-    <w:abstractNumId w:val="8"/>
+    <w:abstractNumId w:val="10"/>
   </w:num>
   <w:num w:numId="5" w16cid:durableId="1902666163">
-    <w:abstractNumId w:val="7"/>
+    <w:abstractNumId w:val="9"/>
   </w:num>
   <w:num w:numId="6" w16cid:durableId="1301106593">
-    <w:abstractNumId w:val="15"/>
+    <w:abstractNumId w:val="21"/>
   </w:num>
   <w:num w:numId="7" w16cid:durableId="704868681">
     <w:abstractNumId w:val="3"/>
   </w:num>
   <w:num w:numId="8" w16cid:durableId="1260329694">
-    <w:abstractNumId w:val="6"/>
+    <w:abstractNumId w:val="7"/>
   </w:num>
   <w:num w:numId="9" w16cid:durableId="104548347">
-    <w:abstractNumId w:val="14"/>
+    <w:abstractNumId w:val="20"/>
   </w:num>
   <w:num w:numId="10" w16cid:durableId="1609772328">
-    <w:abstractNumId w:val="16"/>
+    <w:abstractNumId w:val="22"/>
   </w:num>
   <w:num w:numId="11" w16cid:durableId="1823807521">
     <w:abstractNumId w:val="5"/>
   </w:num>
   <w:num w:numId="12" w16cid:durableId="2032611708">
-    <w:abstractNumId w:val="18"/>
+    <w:abstractNumId w:val="29"/>
   </w:num>
   <w:num w:numId="13" w16cid:durableId="1320843736">
-    <w:abstractNumId w:val="9"/>
+    <w:abstractNumId w:val="14"/>
   </w:num>
   <w:num w:numId="14" w16cid:durableId="742603837">
-    <w:abstractNumId w:val="11"/>
+    <w:abstractNumId w:val="16"/>
   </w:num>
   <w:num w:numId="15" w16cid:durableId="926187062">
-    <w:abstractNumId w:val="12"/>
+    <w:abstractNumId w:val="18"/>
   </w:num>
   <w:num w:numId="16" w16cid:durableId="1481072746">
     <w:abstractNumId w:val="4"/>
   </w:num>
   <w:num w:numId="17" w16cid:durableId="1348211694">
-    <w:abstractNumId w:val="10"/>
+    <w:abstractNumId w:val="15"/>
   </w:num>
   <w:num w:numId="18" w16cid:durableId="1958027079">
     <w:abstractNumId w:val="1"/>
   </w:num>
   <w:num w:numId="19" w16cid:durableId="1718167731">
-    <w:abstractNumId w:val="17"/>
+    <w:abstractNumId w:val="27"/>
   </w:num>
   <w:num w:numId="20" w16cid:durableId="1860194526">
-    <w:abstractNumId w:val="13"/>
+    <w:abstractNumId w:val="19"/>
   </w:num>
   <w:num w:numId="21" w16cid:durableId="1788307968">
     <w:abstractNumId w:val="0"/>
+  </w:num>
+  <w:num w:numId="22" w16cid:durableId="1834879870">
+    <w:abstractNumId w:val="17"/>
+  </w:num>
+  <w:num w:numId="23" w16cid:durableId="301154977">
+    <w:abstractNumId w:val="25"/>
+  </w:num>
+  <w:num w:numId="24" w16cid:durableId="705642798">
+    <w:abstractNumId w:val="12"/>
+  </w:num>
+  <w:num w:numId="25" w16cid:durableId="1942104802">
+    <w:abstractNumId w:val="24"/>
+  </w:num>
+  <w:num w:numId="26" w16cid:durableId="1892306557">
+    <w:abstractNumId w:val="26"/>
+  </w:num>
+  <w:num w:numId="27" w16cid:durableId="1988170308">
+    <w:abstractNumId w:val="28"/>
+  </w:num>
+  <w:num w:numId="28" w16cid:durableId="877670072">
+    <w:abstractNumId w:val="8"/>
+  </w:num>
+  <w:num w:numId="29" w16cid:durableId="1182474789">
+    <w:abstractNumId w:val="13"/>
+  </w:num>
+  <w:num w:numId="30" w16cid:durableId="1355033021">
+    <w:abstractNumId w:val="23"/>
+  </w:num>
+  <w:num w:numId="31" w16cid:durableId="1186553659">
+    <w:abstractNumId w:val="6"/>
+  </w:num>
+  <w:num w:numId="32" w16cid:durableId="900948172">
+    <w:abstractNumId w:val="30"/>
+  </w:num>
+  <w:num w:numId="33" w16cid:durableId="638457597">
+    <w:abstractNumId w:val="11"/>
   </w:num>
 </w:numbering>
 </file>
@@ -10046,6 +14067,25 @@
       <w:bCs/>
     </w:rPr>
   </w:style>
+  <w:style w:type="table" w:styleId="TableGrid">
+    <w:name w:val="Table Grid"/>
+    <w:basedOn w:val="TableNormal"/>
+    <w:uiPriority w:val="39"/>
+    <w:rsid w:val="005D2DD6"/>
+    <w:pPr>
+      <w:spacing w:after="0" w:line="240" w:lineRule="auto"/>
+    </w:pPr>
+    <w:tblPr>
+      <w:tblBorders>
+        <w:top w:val="single" w:sz="4" w:space="0" w:color="auto"/>
+        <w:left w:val="single" w:sz="4" w:space="0" w:color="auto"/>
+        <w:bottom w:val="single" w:sz="4" w:space="0" w:color="auto"/>
+        <w:right w:val="single" w:sz="4" w:space="0" w:color="auto"/>
+        <w:insideH w:val="single" w:sz="4" w:space="0" w:color="auto"/>
+        <w:insideV w:val="single" w:sz="4" w:space="0" w:color="auto"/>
+      </w:tblBorders>
+    </w:tblPr>
+  </w:style>
 </w:styles>
 </file>
 

</xml_diff>